<commit_message>
Added the ConcreteSubject Class that was missing and also updated the docx
</commit_message>
<xml_diff>
--- a/CampusGuard.docx
+++ b/CampusGuard.docx
@@ -3709,10 +3709,10 @@
         <w:tblLook w:val="0000" w:firstRow="0" w:lastRow="0" w:firstColumn="0" w:lastColumn="0" w:noHBand="0" w:noVBand="0"/>
       </w:tblPr>
       <w:tblGrid>
-        <w:gridCol w:w="2400"/>
-        <w:gridCol w:w="2000"/>
-        <w:gridCol w:w="2700"/>
-        <w:gridCol w:w="2700"/>
+        <w:gridCol w:w="1560"/>
+        <w:gridCol w:w="1780"/>
+        <w:gridCol w:w="4776"/>
+        <w:gridCol w:w="1684"/>
       </w:tblGrid>
       <w:tr>
         <w:tblPrEx>
@@ -3919,7 +3919,19 @@
               <w:rPr>
                 <w:rFonts w:ascii="Calibri" w:eastAsia="Calibri" w:hAnsi="Calibri" w:cs="Calibri"/>
               </w:rPr>
-              <w:t>update(Incident*)</w:t>
+              <w:t>update(</w:t>
+            </w:r>
+            <w:r>
+              <w:rPr>
+                <w:rFonts w:ascii="Calibri" w:eastAsia="Calibri" w:hAnsi="Calibri" w:cs="Calibri"/>
+              </w:rPr>
+              <w:t>Subject</w:t>
+            </w:r>
+            <w:r>
+              <w:rPr>
+                <w:rFonts w:ascii="Calibri" w:eastAsia="Calibri" w:hAnsi="Calibri" w:cs="Calibri"/>
+              </w:rPr>
+              <w:t>*)</w:t>
             </w:r>
           </w:p>
         </w:tc>
@@ -4037,7 +4049,19 @@
               <w:rPr>
                 <w:rFonts w:ascii="Calibri" w:eastAsia="Calibri" w:hAnsi="Calibri" w:cs="Calibri"/>
               </w:rPr>
-              <w:t>update(Incident*)</w:t>
+              <w:t>update(</w:t>
+            </w:r>
+            <w:r>
+              <w:rPr>
+                <w:rFonts w:ascii="Calibri" w:eastAsia="Calibri" w:hAnsi="Calibri" w:cs="Calibri"/>
+              </w:rPr>
+              <w:t>Subject</w:t>
+            </w:r>
+            <w:r>
+              <w:rPr>
+                <w:rFonts w:ascii="Calibri" w:eastAsia="Calibri" w:hAnsi="Calibri" w:cs="Calibri"/>
+              </w:rPr>
+              <w:t>*)</w:t>
             </w:r>
           </w:p>
         </w:tc>
@@ -4116,12 +4140,20 @@
             </w:tcMar>
           </w:tcPr>
           <w:p>
+            <w:proofErr w:type="spellStart"/>
+            <w:r>
+              <w:rPr>
+                <w:rFonts w:ascii="Calibri" w:eastAsia="Calibri" w:hAnsi="Calibri" w:cs="Calibri"/>
+              </w:rPr>
+              <w:t>Concrete</w:t>
+            </w:r>
             <w:r>
               <w:rPr>
                 <w:rFonts w:ascii="Calibri" w:eastAsia="Calibri" w:hAnsi="Calibri" w:cs="Calibri"/>
               </w:rPr>
               <w:t>Subject</w:t>
             </w:r>
+            <w:proofErr w:type="spellEnd"/>
           </w:p>
         </w:tc>
         <w:tc>
@@ -4145,7 +4177,7 @@
               <w:rPr>
                 <w:rFonts w:ascii="Calibri" w:eastAsia="Calibri" w:hAnsi="Calibri" w:cs="Calibri"/>
               </w:rPr>
-              <w:t>observers: vector&lt;Observer*&gt;, attach(), notify()</w:t>
+              <w:t>inherits attach/detach/notify from Subject; adds status, id, type, location</w:t>
             </w:r>
           </w:p>
         </w:tc>
@@ -4170,7 +4202,143 @@
               <w:rPr>
                 <w:rFonts w:ascii="Calibri" w:eastAsia="Calibri" w:hAnsi="Calibri" w:cs="Calibri"/>
               </w:rPr>
-              <w:t>non-owning references to attached Observers</w:t>
+              <w:t>—</w:t>
+            </w:r>
+          </w:p>
+        </w:tc>
+      </w:tr>
+      <w:tr>
+        <w:tblPrEx>
+          <w:tblCellMar>
+            <w:top w:w="0" w:type="dxa"/>
+            <w:bottom w:w="0" w:type="dxa"/>
+          </w:tblCellMar>
+        </w:tblPrEx>
+        <w:tc>
+          <w:tcPr>
+            <w:tcW w:w="2400" w:type="dxa"/>
+            <w:tcBorders>
+              <w:top w:val="single" w:sz="2" w:space="0" w:color="BFBFBF"/>
+              <w:left w:val="single" w:sz="2" w:space="0" w:color="BFBFBF"/>
+              <w:bottom w:val="single" w:sz="2" w:space="0" w:color="BFBFBF"/>
+              <w:right w:val="single" w:sz="2" w:space="0" w:color="BFBFBF"/>
+            </w:tcBorders>
+            <w:tcMar>
+              <w:top w:w="80" w:type="dxa"/>
+              <w:left w:w="100" w:type="dxa"/>
+              <w:bottom w:w="80" w:type="dxa"/>
+              <w:right w:w="100" w:type="dxa"/>
+            </w:tcMar>
+          </w:tcPr>
+          <w:p>
+            <w:pPr>
+              <w:rPr>
+                <w:rFonts w:ascii="Calibri" w:eastAsia="Calibri" w:hAnsi="Calibri" w:cs="Calibri"/>
+              </w:rPr>
+            </w:pPr>
+            <w:r>
+              <w:rPr>
+                <w:rFonts w:ascii="Calibri" w:eastAsia="Calibri" w:hAnsi="Calibri" w:cs="Calibri"/>
+              </w:rPr>
+              <w:t>Subject</w:t>
+            </w:r>
+          </w:p>
+        </w:tc>
+        <w:tc>
+          <w:tcPr>
+            <w:tcW w:w="2000" w:type="dxa"/>
+            <w:tcBorders>
+              <w:top w:val="single" w:sz="2" w:space="0" w:color="BFBFBF"/>
+              <w:left w:val="single" w:sz="2" w:space="0" w:color="BFBFBF"/>
+              <w:bottom w:val="single" w:sz="2" w:space="0" w:color="BFBFBF"/>
+              <w:right w:val="single" w:sz="2" w:space="0" w:color="BFBFBF"/>
+            </w:tcBorders>
+            <w:tcMar>
+              <w:top w:w="80" w:type="dxa"/>
+              <w:left w:w="100" w:type="dxa"/>
+              <w:bottom w:w="80" w:type="dxa"/>
+              <w:right w:w="100" w:type="dxa"/>
+            </w:tcMar>
+          </w:tcPr>
+          <w:p>
+            <w:pPr>
+              <w:rPr>
+                <w:rFonts w:ascii="Calibri" w:eastAsia="Calibri" w:hAnsi="Calibri" w:cs="Calibri"/>
+              </w:rPr>
+            </w:pPr>
+            <w:r>
+              <w:rPr>
+                <w:rFonts w:ascii="Calibri" w:eastAsia="Calibri" w:hAnsi="Calibri" w:cs="Calibri"/>
+              </w:rPr>
+              <w:t>Subject</w:t>
+            </w:r>
+          </w:p>
+        </w:tc>
+        <w:tc>
+          <w:tcPr>
+            <w:tcW w:w="2700" w:type="dxa"/>
+            <w:tcBorders>
+              <w:top w:val="single" w:sz="2" w:space="0" w:color="BFBFBF"/>
+              <w:left w:val="single" w:sz="2" w:space="0" w:color="BFBFBF"/>
+              <w:bottom w:val="single" w:sz="2" w:space="0" w:color="BFBFBF"/>
+              <w:right w:val="single" w:sz="2" w:space="0" w:color="BFBFBF"/>
+            </w:tcBorders>
+            <w:tcMar>
+              <w:top w:w="80" w:type="dxa"/>
+              <w:left w:w="100" w:type="dxa"/>
+              <w:bottom w:w="80" w:type="dxa"/>
+              <w:right w:w="100" w:type="dxa"/>
+            </w:tcMar>
+          </w:tcPr>
+          <w:p>
+            <w:pPr>
+              <w:rPr>
+                <w:rFonts w:ascii="Calibri" w:eastAsia="Calibri" w:hAnsi="Calibri" w:cs="Calibri"/>
+              </w:rPr>
+            </w:pPr>
+            <w:proofErr w:type="spellStart"/>
+            <w:r>
+              <w:rPr>
+                <w:rFonts w:ascii="Calibri" w:eastAsia="Calibri" w:hAnsi="Calibri" w:cs="Calibri"/>
+              </w:rPr>
+              <w:t>Observers:vector</w:t>
+            </w:r>
+            <w:proofErr w:type="spellEnd"/>
+            <w:r>
+              <w:rPr>
+                <w:rFonts w:ascii="Calibri" w:eastAsia="Calibri" w:hAnsi="Calibri" w:cs="Calibri"/>
+              </w:rPr>
+              <w:t>&lt;Observers*&gt;,attach(),detach(),notify()</w:t>
+            </w:r>
+          </w:p>
+        </w:tc>
+        <w:tc>
+          <w:tcPr>
+            <w:tcW w:w="2700" w:type="dxa"/>
+            <w:tcBorders>
+              <w:top w:val="single" w:sz="2" w:space="0" w:color="BFBFBF"/>
+              <w:left w:val="single" w:sz="2" w:space="0" w:color="BFBFBF"/>
+              <w:bottom w:val="single" w:sz="2" w:space="0" w:color="BFBFBF"/>
+              <w:right w:val="single" w:sz="2" w:space="0" w:color="BFBFBF"/>
+            </w:tcBorders>
+            <w:tcMar>
+              <w:top w:w="80" w:type="dxa"/>
+              <w:left w:w="100" w:type="dxa"/>
+              <w:bottom w:w="80" w:type="dxa"/>
+              <w:right w:w="100" w:type="dxa"/>
+            </w:tcMar>
+          </w:tcPr>
+          <w:p>
+            <w:pPr>
+              <w:rPr>
+                <w:rFonts w:ascii="Calibri" w:eastAsia="Calibri" w:hAnsi="Calibri" w:cs="Calibri"/>
+              </w:rPr>
+            </w:pPr>
+            <w:r>
+              <w:rPr>
+                <w:rFonts w:ascii="Calibri" w:eastAsia="Calibri" w:hAnsi="Calibri" w:cs="Calibri"/>
+              </w:rPr>
+              <w:t>Non-owning references to attached Observers</w:t>
             </w:r>
           </w:p>
         </w:tc>
@@ -5971,6 +6139,100 @@
               <w:rPr>
                 <w:rFonts w:ascii="Calibri" w:eastAsia="Calibri" w:hAnsi="Calibri" w:cs="Calibri"/>
               </w:rPr>
+              <w:t>Subject</w:t>
+            </w:r>
+          </w:p>
+        </w:tc>
+      </w:tr>
+      <w:tr>
+        <w:tblPrEx>
+          <w:tblCellMar>
+            <w:top w:w="0" w:type="dxa"/>
+            <w:bottom w:w="0" w:type="dxa"/>
+          </w:tblCellMar>
+        </w:tblPrEx>
+        <w:tc>
+          <w:tcPr>
+            <w:tcW w:w="2000" w:type="dxa"/>
+            <w:tcBorders>
+              <w:top w:val="single" w:sz="2" w:space="0" w:color="BFBFBF"/>
+              <w:left w:val="single" w:sz="2" w:space="0" w:color="BFBFBF"/>
+              <w:bottom w:val="single" w:sz="2" w:space="0" w:color="BFBFBF"/>
+              <w:right w:val="single" w:sz="2" w:space="0" w:color="BFBFBF"/>
+            </w:tcBorders>
+            <w:tcMar>
+              <w:top w:w="80" w:type="dxa"/>
+              <w:left w:w="100" w:type="dxa"/>
+              <w:bottom w:w="80" w:type="dxa"/>
+              <w:right w:w="100" w:type="dxa"/>
+            </w:tcMar>
+          </w:tcPr>
+          <w:p>
+            <w:pPr>
+              <w:rPr>
+                <w:rFonts w:ascii="Calibri" w:eastAsia="Calibri" w:hAnsi="Calibri" w:cs="Calibri"/>
+              </w:rPr>
+            </w:pPr>
+          </w:p>
+        </w:tc>
+        <w:tc>
+          <w:tcPr>
+            <w:tcW w:w="2000" w:type="dxa"/>
+            <w:tcBorders>
+              <w:top w:val="single" w:sz="2" w:space="0" w:color="BFBFBF"/>
+              <w:left w:val="single" w:sz="2" w:space="0" w:color="BFBFBF"/>
+              <w:bottom w:val="single" w:sz="2" w:space="0" w:color="BFBFBF"/>
+              <w:right w:val="single" w:sz="2" w:space="0" w:color="BFBFBF"/>
+            </w:tcBorders>
+            <w:tcMar>
+              <w:top w:w="80" w:type="dxa"/>
+              <w:left w:w="100" w:type="dxa"/>
+              <w:bottom w:w="80" w:type="dxa"/>
+              <w:right w:w="100" w:type="dxa"/>
+            </w:tcMar>
+          </w:tcPr>
+          <w:p>
+            <w:pPr>
+              <w:rPr>
+                <w:rFonts w:ascii="Calibri" w:eastAsia="Calibri" w:hAnsi="Calibri" w:cs="Calibri"/>
+              </w:rPr>
+            </w:pPr>
+            <w:proofErr w:type="spellStart"/>
+            <w:r>
+              <w:rPr>
+                <w:rFonts w:ascii="Calibri" w:eastAsia="Calibri" w:hAnsi="Calibri" w:cs="Calibri"/>
+              </w:rPr>
+              <w:t>ConcreteSubject</w:t>
+            </w:r>
+            <w:proofErr w:type="spellEnd"/>
+          </w:p>
+        </w:tc>
+        <w:tc>
+          <w:tcPr>
+            <w:tcW w:w="5800" w:type="dxa"/>
+            <w:tcBorders>
+              <w:top w:val="single" w:sz="2" w:space="0" w:color="BFBFBF"/>
+              <w:left w:val="single" w:sz="2" w:space="0" w:color="BFBFBF"/>
+              <w:bottom w:val="single" w:sz="2" w:space="0" w:color="BFBFBF"/>
+              <w:right w:val="single" w:sz="2" w:space="0" w:color="BFBFBF"/>
+            </w:tcBorders>
+            <w:tcMar>
+              <w:top w:w="80" w:type="dxa"/>
+              <w:left w:w="100" w:type="dxa"/>
+              <w:bottom w:w="80" w:type="dxa"/>
+              <w:right w:w="100" w:type="dxa"/>
+            </w:tcMar>
+          </w:tcPr>
+          <w:p>
+            <w:pPr>
+              <w:rPr>
+                <w:rFonts w:ascii="Calibri" w:eastAsia="Calibri" w:hAnsi="Calibri" w:cs="Calibri"/>
+              </w:rPr>
+            </w:pPr>
+            <w:r>
+              <w:rPr>
+                <w:rFonts w:ascii="Calibri" w:eastAsia="Calibri" w:hAnsi="Calibri" w:cs="Calibri"/>
+              </w:rPr>
               <w:t>Incident</w:t>
             </w:r>
           </w:p>
@@ -6154,7 +6416,6 @@
         <w:spacing w:before="240" w:after="120"/>
       </w:pPr>
       <w:r>
-        <w:lastRenderedPageBreak/>
         <w:t>4.1 State — for Incident status</w:t>
       </w:r>
     </w:p>
@@ -6916,6 +7177,7 @@
         <w:spacing w:before="320" w:after="160"/>
       </w:pPr>
       <w:r>
+        <w:lastRenderedPageBreak/>
         <w:t>6. Where the Six Patterns Interact</w:t>
       </w:r>
     </w:p>
@@ -7068,7 +7330,6 @@
           <w:sz w:val="22"/>
           <w:szCs w:val="22"/>
         </w:rPr>
-        <w:lastRenderedPageBreak/>
         <w:t>That alert travels through the Adapter (</w:t>
       </w:r>
       <w:proofErr w:type="spellStart"/>
@@ -7925,7 +8186,6 @@
   <w:style w:type="character" w:default="1" w:styleId="DefaultParagraphFont">
     <w:name w:val="Default Paragraph Font"/>
     <w:uiPriority w:val="1"/>
-    <w:semiHidden/>
     <w:unhideWhenUsed/>
   </w:style>
   <w:style w:type="table" w:default="1" w:styleId="TableNormal">

</xml_diff>

<commit_message>
Updated pdf with valgrind and gdb evidence
</commit_message>
<xml_diff>
--- a/CampusGuard.docx
+++ b/CampusGuard.docx
@@ -38,70 +38,38 @@
           <w:lang w:val="en-GB"/>
         </w:rPr>
       </w:pPr>
-      <w:proofErr w:type="spellStart"/>
-      <w:r>
-        <w:rPr>
-          <w:lang w:val="en-GB"/>
-        </w:rPr>
-        <w:t>Showlon</w:t>
-      </w:r>
-      <w:proofErr w:type="spellEnd"/>
-      <w:r>
-        <w:rPr>
-          <w:lang w:val="en-GB"/>
-        </w:rPr>
-        <w:t xml:space="preserve"> Hunter - </w:t>
-      </w:r>
-      <w:proofErr w:type="spellStart"/>
-      <w:r>
-        <w:rPr>
-          <w:lang w:val="en-GB"/>
-        </w:rPr>
-        <w:t>u25502469</w:t>
-      </w:r>
-      <w:proofErr w:type="spellEnd"/>
-    </w:p>
-    <w:p>
-      <w:pPr>
-        <w:rPr>
-          <w:lang w:val="en-GB"/>
-        </w:rPr>
-      </w:pPr>
-      <w:r>
-        <w:rPr>
-          <w:lang w:val="en-GB"/>
-        </w:rPr>
-        <w:t xml:space="preserve">Tamima Alam Touhid - </w:t>
-      </w:r>
-      <w:proofErr w:type="spellStart"/>
-      <w:r>
-        <w:rPr>
-          <w:lang w:val="en-GB"/>
-        </w:rPr>
-        <w:t>u24691284</w:t>
-      </w:r>
-      <w:proofErr w:type="spellEnd"/>
-    </w:p>
-    <w:p>
-      <w:pPr>
-        <w:rPr>
-          <w:lang w:val="en-GB"/>
-        </w:rPr>
-      </w:pPr>
-      <w:r>
-        <w:rPr>
-          <w:lang w:val="en-GB"/>
-        </w:rPr>
-        <w:t xml:space="preserve">Francois Venter - </w:t>
-      </w:r>
-      <w:proofErr w:type="spellStart"/>
-      <w:r>
-        <w:rPr>
-          <w:lang w:val="en-GB"/>
-        </w:rPr>
-        <w:t>u25555202</w:t>
-      </w:r>
-      <w:proofErr w:type="spellEnd"/>
+      <w:r>
+        <w:rPr>
+          <w:lang w:val="en-GB"/>
+        </w:rPr>
+        <w:t>Showlon Hunter - u25502469</w:t>
+      </w:r>
+    </w:p>
+    <w:p>
+      <w:pPr>
+        <w:rPr>
+          <w:lang w:val="en-GB"/>
+        </w:rPr>
+      </w:pPr>
+      <w:r>
+        <w:rPr>
+          <w:lang w:val="en-GB"/>
+        </w:rPr>
+        <w:t>Tamima Alam Touhid - u24691284</w:t>
+      </w:r>
+    </w:p>
+    <w:p>
+      <w:pPr>
+        <w:rPr>
+          <w:lang w:val="en-GB"/>
+        </w:rPr>
+      </w:pPr>
+      <w:r>
+        <w:rPr>
+          <w:lang w:val="en-GB"/>
+        </w:rPr>
+        <w:t>Francois Venter - u25555202</w:t>
+      </w:r>
     </w:p>
     <w:p>
       <w:pPr>
@@ -120,7 +88,6 @@
           <w:lang w:val="en-GB"/>
         </w:rPr>
       </w:pPr>
-      <w:proofErr w:type="spellStart"/>
       <w:r>
         <w:rPr>
           <w:b/>
@@ -129,18 +96,7 @@
           <w:u w:val="single"/>
           <w:lang w:val="en-GB"/>
         </w:rPr>
-        <w:t>Github</w:t>
-      </w:r>
-      <w:proofErr w:type="spellEnd"/>
-      <w:r>
-        <w:rPr>
-          <w:b/>
-          <w:bCs/>
-          <w:szCs w:val="22"/>
-          <w:u w:val="single"/>
-          <w:lang w:val="en-GB"/>
-        </w:rPr>
-        <w:t xml:space="preserve"> repository link:</w:t>
+        <w:t>Github repository link:</w:t>
       </w:r>
     </w:p>
     <w:p>
@@ -155,49 +111,8 @@
             <w:rStyle w:val="Hyperlink"/>
             <w:lang w:val="en-GB"/>
           </w:rPr>
-          <w:t>https://</w:t>
+          <w:t>https://github.com/u25555202-maker/COS214-Prac5</w:t>
         </w:r>
-        <w:proofErr w:type="spellStart"/>
-        <w:r>
-          <w:rPr>
-            <w:rStyle w:val="Hyperlink"/>
-            <w:lang w:val="en-GB"/>
-          </w:rPr>
-          <w:t>github.com</w:t>
-        </w:r>
-        <w:proofErr w:type="spellEnd"/>
-        <w:r>
-          <w:rPr>
-            <w:rStyle w:val="Hyperlink"/>
-            <w:lang w:val="en-GB"/>
-          </w:rPr>
-          <w:t>/</w:t>
-        </w:r>
-        <w:proofErr w:type="spellStart"/>
-        <w:r>
-          <w:rPr>
-            <w:rStyle w:val="Hyperlink"/>
-            <w:lang w:val="en-GB"/>
-          </w:rPr>
-          <w:t>u25555202</w:t>
-        </w:r>
-        <w:proofErr w:type="spellEnd"/>
-        <w:r>
-          <w:rPr>
-            <w:rStyle w:val="Hyperlink"/>
-            <w:lang w:val="en-GB"/>
-          </w:rPr>
-          <w:t>-maker/</w:t>
-        </w:r>
-        <w:proofErr w:type="spellStart"/>
-        <w:r>
-          <w:rPr>
-            <w:rStyle w:val="Hyperlink"/>
-            <w:lang w:val="en-GB"/>
-          </w:rPr>
-          <w:t>COS214-Prac5</w:t>
-        </w:r>
-        <w:proofErr w:type="spellEnd"/>
       </w:hyperlink>
       <w:r>
         <w:rPr>
@@ -222,7 +137,6 @@
           <w:szCs w:val="52"/>
         </w:rPr>
       </w:pPr>
-      <w:proofErr w:type="spellStart"/>
       <w:r>
         <w:rPr>
           <w:sz w:val="52"/>
@@ -230,7 +144,6 @@
         </w:rPr>
         <w:t>CampusGuard</w:t>
       </w:r>
-      <w:proofErr w:type="spellEnd"/>
     </w:p>
     <w:p>
       <w:pPr>
@@ -267,21 +180,12 @@
       <w:pPr>
         <w:spacing w:after="140"/>
       </w:pPr>
-      <w:proofErr w:type="spellStart"/>
       <w:r>
         <w:rPr>
           <w:rFonts w:eastAsia="Calibri" w:cs="Calibri"/>
           <w:szCs w:val="22"/>
         </w:rPr>
-        <w:t>CampusGuard</w:t>
-      </w:r>
-      <w:proofErr w:type="spellEnd"/>
-      <w:r>
-        <w:rPr>
-          <w:rFonts w:eastAsia="Calibri" w:cs="Calibri"/>
-          <w:szCs w:val="22"/>
-        </w:rPr>
-        <w:t xml:space="preserve"> coordinates a university's response to an incident from the moment it is reported until it is resolved. Concretely, the system:</w:t>
+        <w:t>CampusGuard coordinates a university's response to an incident from the moment it is reported until it is resolved. Concretely, the system:</w:t>
       </w:r>
     </w:p>
     <w:p>
@@ -347,25 +251,13 @@
         </w:numPr>
         <w:spacing w:after="80"/>
       </w:pPr>
-      <w:proofErr w:type="spellStart"/>
-      <w:proofErr w:type="gramStart"/>
       <w:r>
         <w:rPr>
           <w:rFonts w:ascii="Calibri" w:eastAsia="Calibri" w:hAnsi="Calibri" w:cs="Calibri"/>
           <w:sz w:val="22"/>
           <w:szCs w:val="22"/>
         </w:rPr>
-        <w:t>lets</w:t>
-      </w:r>
-      <w:proofErr w:type="spellEnd"/>
-      <w:proofErr w:type="gramEnd"/>
-      <w:r>
-        <w:rPr>
-          <w:rFonts w:ascii="Calibri" w:eastAsia="Calibri" w:hAnsi="Calibri" w:cs="Calibri"/>
-          <w:sz w:val="22"/>
-          <w:szCs w:val="22"/>
-        </w:rPr>
-        <w:t xml:space="preserve"> an operator issue discrete actions (dispatch, evacuate, alert, cancel) that trigger real domain behaviour;</w:t>
+        <w:t>lets an operator issue discrete actions (dispatch, evacuate, alert, cancel) that trigger real domain behaviour;</w:t>
       </w:r>
     </w:p>
     <w:p>
@@ -401,25 +293,7 @@
           <w:sz w:val="22"/>
           <w:szCs w:val="22"/>
         </w:rPr>
-        <w:t xml:space="preserve">integrates with an existing campus paging system whose interface is incompatible with the interface </w:t>
-      </w:r>
-      <w:proofErr w:type="spellStart"/>
-      <w:r>
-        <w:rPr>
-          <w:rFonts w:ascii="Calibri" w:eastAsia="Calibri" w:hAnsi="Calibri" w:cs="Calibri"/>
-          <w:sz w:val="22"/>
-          <w:szCs w:val="22"/>
-        </w:rPr>
-        <w:t>CampusGuard's</w:t>
-      </w:r>
-      <w:proofErr w:type="spellEnd"/>
-      <w:r>
-        <w:rPr>
-          <w:rFonts w:ascii="Calibri" w:eastAsia="Calibri" w:hAnsi="Calibri" w:cs="Calibri"/>
-          <w:sz w:val="22"/>
-          <w:szCs w:val="22"/>
-        </w:rPr>
-        <w:t xml:space="preserve"> own components use; and</w:t>
+        <w:t>integrates with an existing campus paging system whose interface is incompatible with the interface CampusGuard's own components use; and</w:t>
       </w:r>
     </w:p>
     <w:p>
@@ -725,14 +599,12 @@
             </w:tcMar>
           </w:tcPr>
           <w:p>
-            <w:proofErr w:type="spellStart"/>
             <w:r>
               <w:rPr>
                 <w:rFonts w:eastAsia="Calibri" w:cs="Calibri"/>
               </w:rPr>
               <w:t>DispatchUnitCommand</w:t>
             </w:r>
-            <w:proofErr w:type="spellEnd"/>
           </w:p>
         </w:tc>
         <w:tc>
@@ -752,14 +624,12 @@
             </w:tcMar>
           </w:tcPr>
           <w:p>
-            <w:proofErr w:type="spellStart"/>
             <w:r>
               <w:rPr>
                 <w:rFonts w:eastAsia="Calibri" w:cs="Calibri"/>
               </w:rPr>
               <w:t>ConcreteCommand</w:t>
             </w:r>
-            <w:proofErr w:type="spellEnd"/>
           </w:p>
         </w:tc>
         <w:tc>
@@ -808,21 +678,7 @@
               <w:rPr>
                 <w:rFonts w:eastAsia="Calibri" w:cs="Calibri"/>
               </w:rPr>
-              <w:t xml:space="preserve">receiver: </w:t>
-            </w:r>
-            <w:proofErr w:type="spellStart"/>
-            <w:r>
-              <w:rPr>
-                <w:rFonts w:eastAsia="Calibri" w:cs="Calibri"/>
-              </w:rPr>
-              <w:t>ResponseComponent</w:t>
-            </w:r>
-            <w:proofErr w:type="spellEnd"/>
-            <w:r>
-              <w:rPr>
-                <w:rFonts w:eastAsia="Calibri" w:cs="Calibri"/>
-              </w:rPr>
-              <w:t>* (non-owning)</w:t>
+              <w:t>receiver: ResponseComponent* (non-owning)</w:t>
             </w:r>
           </w:p>
         </w:tc>
@@ -845,14 +701,12 @@
             </w:tcMar>
           </w:tcPr>
           <w:p>
-            <w:proofErr w:type="spellStart"/>
             <w:r>
               <w:rPr>
                 <w:rFonts w:eastAsia="Calibri" w:cs="Calibri"/>
               </w:rPr>
               <w:t>LockAreaCommand</w:t>
             </w:r>
-            <w:proofErr w:type="spellEnd"/>
           </w:p>
         </w:tc>
         <w:tc>
@@ -872,19 +726,11 @@
             </w:tcMar>
           </w:tcPr>
           <w:p>
-            <w:proofErr w:type="spellStart"/>
-            <w:r>
-              <w:rPr>
-                <w:rFonts w:eastAsia="Calibri" w:cs="Calibri"/>
-              </w:rPr>
-              <w:t>ConcreteCommand</w:t>
-            </w:r>
-            <w:proofErr w:type="spellEnd"/>
-            <w:r>
-              <w:rPr>
-                <w:rFonts w:eastAsia="Calibri" w:cs="Calibri"/>
-              </w:rPr>
-              <w:t xml:space="preserve"> (reversible)</w:t>
+            <w:r>
+              <w:rPr>
+                <w:rFonts w:eastAsia="Calibri" w:cs="Calibri"/>
+              </w:rPr>
+              <w:t>ConcreteCommand (reversible)</w:t>
             </w:r>
           </w:p>
         </w:tc>
@@ -934,21 +780,7 @@
               <w:rPr>
                 <w:rFonts w:eastAsia="Calibri" w:cs="Calibri"/>
               </w:rPr>
-              <w:t xml:space="preserve">receiver: </w:t>
-            </w:r>
-            <w:proofErr w:type="spellStart"/>
-            <w:r>
-              <w:rPr>
-                <w:rFonts w:eastAsia="Calibri" w:cs="Calibri"/>
-              </w:rPr>
-              <w:t>AccessControlSystem</w:t>
-            </w:r>
-            <w:proofErr w:type="spellEnd"/>
-            <w:r>
-              <w:rPr>
-                <w:rFonts w:eastAsia="Calibri" w:cs="Calibri"/>
-              </w:rPr>
-              <w:t>* (non-owning)</w:t>
+              <w:t>receiver: AccessControlSystem* (non-owning)</w:t>
             </w:r>
           </w:p>
         </w:tc>
@@ -971,7 +803,6 @@
             </w:tcMar>
           </w:tcPr>
           <w:p>
-            <w:proofErr w:type="spellStart"/>
             <w:r>
               <w:rPr>
                 <w:rFonts w:eastAsia="Calibri" w:cs="Calibri"/>
@@ -979,7 +810,6 @@
               <w:lastRenderedPageBreak/>
               <w:t>AlertCommand</w:t>
             </w:r>
-            <w:proofErr w:type="spellEnd"/>
           </w:p>
         </w:tc>
         <w:tc>
@@ -999,14 +829,12 @@
             </w:tcMar>
           </w:tcPr>
           <w:p>
-            <w:proofErr w:type="spellStart"/>
             <w:r>
               <w:rPr>
                 <w:rFonts w:eastAsia="Calibri" w:cs="Calibri"/>
               </w:rPr>
               <w:t>ConcreteCommand</w:t>
             </w:r>
-            <w:proofErr w:type="spellEnd"/>
           </w:p>
         </w:tc>
         <w:tc>
@@ -1055,21 +883,7 @@
               <w:rPr>
                 <w:rFonts w:eastAsia="Calibri" w:cs="Calibri"/>
               </w:rPr>
-              <w:t xml:space="preserve">receiver: </w:t>
-            </w:r>
-            <w:proofErr w:type="spellStart"/>
-            <w:r>
-              <w:rPr>
-                <w:rFonts w:eastAsia="Calibri" w:cs="Calibri"/>
-              </w:rPr>
-              <w:t>CommunicationChannel</w:t>
-            </w:r>
-            <w:proofErr w:type="spellEnd"/>
-            <w:r>
-              <w:rPr>
-                <w:rFonts w:eastAsia="Calibri" w:cs="Calibri"/>
-              </w:rPr>
-              <w:t>* (non-owning)</w:t>
+              <w:t>receiver: CommunicationChannel* (non-owning)</w:t>
             </w:r>
           </w:p>
         </w:tc>
@@ -1092,14 +906,12 @@
             </w:tcMar>
           </w:tcPr>
           <w:p>
-            <w:proofErr w:type="spellStart"/>
             <w:r>
               <w:rPr>
                 <w:rFonts w:eastAsia="Calibri" w:cs="Calibri"/>
               </w:rPr>
               <w:t>EvacuationCommand</w:t>
             </w:r>
-            <w:proofErr w:type="spellEnd"/>
           </w:p>
         </w:tc>
         <w:tc>
@@ -1119,14 +931,12 @@
             </w:tcMar>
           </w:tcPr>
           <w:p>
-            <w:proofErr w:type="spellStart"/>
             <w:r>
               <w:rPr>
                 <w:rFonts w:eastAsia="Calibri" w:cs="Calibri"/>
               </w:rPr>
               <w:t>ConcreteCommand</w:t>
             </w:r>
-            <w:proofErr w:type="spellEnd"/>
           </w:p>
         </w:tc>
         <w:tc>
@@ -1175,21 +985,7 @@
               <w:rPr>
                 <w:rFonts w:eastAsia="Calibri" w:cs="Calibri"/>
               </w:rPr>
-              <w:t xml:space="preserve">receiver: </w:t>
-            </w:r>
-            <w:proofErr w:type="spellStart"/>
-            <w:r>
-              <w:rPr>
-                <w:rFonts w:eastAsia="Calibri" w:cs="Calibri"/>
-              </w:rPr>
-              <w:t>FacilitiesTeam</w:t>
-            </w:r>
-            <w:proofErr w:type="spellEnd"/>
-            <w:r>
-              <w:rPr>
-                <w:rFonts w:eastAsia="Calibri" w:cs="Calibri"/>
-              </w:rPr>
-              <w:t>* (non-owning)</w:t>
+              <w:t>receiver: FacilitiesTeam* (non-owning)</w:t>
             </w:r>
           </w:p>
         </w:tc>
@@ -1212,14 +1008,12 @@
             </w:tcMar>
           </w:tcPr>
           <w:p>
-            <w:proofErr w:type="spellStart"/>
             <w:r>
               <w:rPr>
                 <w:rFonts w:eastAsia="Calibri" w:cs="Calibri"/>
               </w:rPr>
               <w:t>CancelCommand</w:t>
             </w:r>
-            <w:proofErr w:type="spellEnd"/>
           </w:p>
         </w:tc>
         <w:tc>
@@ -1239,14 +1033,12 @@
             </w:tcMar>
           </w:tcPr>
           <w:p>
-            <w:proofErr w:type="spellStart"/>
             <w:r>
               <w:rPr>
                 <w:rFonts w:eastAsia="Calibri" w:cs="Calibri"/>
               </w:rPr>
               <w:t>ConcreteCommand</w:t>
             </w:r>
-            <w:proofErr w:type="spellEnd"/>
           </w:p>
         </w:tc>
         <w:tc>
@@ -1318,14 +1110,12 @@
             </w:tcMar>
           </w:tcPr>
           <w:p>
-            <w:proofErr w:type="spellStart"/>
             <w:r>
               <w:rPr>
                 <w:rFonts w:eastAsia="Calibri" w:cs="Calibri"/>
               </w:rPr>
               <w:t>OperatorConsole</w:t>
             </w:r>
-            <w:proofErr w:type="spellEnd"/>
           </w:p>
         </w:tc>
         <w:tc>
@@ -1374,21 +1164,7 @@
               <w:rPr>
                 <w:rFonts w:eastAsia="Calibri" w:cs="Calibri"/>
               </w:rPr>
-              <w:t>history: vector&lt;</w:t>
-            </w:r>
-            <w:proofErr w:type="spellStart"/>
-            <w:r>
-              <w:rPr>
-                <w:rFonts w:eastAsia="Calibri" w:cs="Calibri"/>
-              </w:rPr>
-              <w:t>unique_ptr</w:t>
-            </w:r>
-            <w:proofErr w:type="spellEnd"/>
-            <w:r>
-              <w:rPr>
-                <w:rFonts w:eastAsia="Calibri" w:cs="Calibri"/>
-              </w:rPr>
-              <w:t>&lt;Command&gt;&gt;</w:t>
+              <w:t>history: vector&lt;unique_ptr&lt;Command&gt;&gt;</w:t>
             </w:r>
           </w:p>
         </w:tc>
@@ -1590,14 +1366,12 @@
             </w:tcMar>
           </w:tcPr>
           <w:p>
-            <w:proofErr w:type="spellStart"/>
             <w:r>
               <w:rPr>
                 <w:rFonts w:eastAsia="Calibri" w:cs="Calibri"/>
               </w:rPr>
               <w:t>ResponseMediator</w:t>
             </w:r>
-            <w:proofErr w:type="spellEnd"/>
           </w:p>
         </w:tc>
         <w:tc>
@@ -1642,33 +1416,11 @@
             </w:tcMar>
           </w:tcPr>
           <w:p>
-            <w:proofErr w:type="spellStart"/>
-            <w:r>
-              <w:rPr>
-                <w:rFonts w:eastAsia="Calibri" w:cs="Calibri"/>
-              </w:rPr>
-              <w:t>componentArrived</w:t>
-            </w:r>
-            <w:proofErr w:type="spellEnd"/>
-            <w:r>
-              <w:rPr>
-                <w:rFonts w:eastAsia="Calibri" w:cs="Calibri"/>
-              </w:rPr>
-              <w:t xml:space="preserve">(), </w:t>
-            </w:r>
-            <w:proofErr w:type="spellStart"/>
-            <w:r>
-              <w:rPr>
-                <w:rFonts w:eastAsia="Calibri" w:cs="Calibri"/>
-              </w:rPr>
-              <w:t>componentFinished</w:t>
-            </w:r>
-            <w:proofErr w:type="spellEnd"/>
-            <w:r>
-              <w:rPr>
-                <w:rFonts w:eastAsia="Calibri" w:cs="Calibri"/>
-              </w:rPr>
-              <w:t>()</w:t>
+            <w:r>
+              <w:rPr>
+                <w:rFonts w:eastAsia="Calibri" w:cs="Calibri"/>
+              </w:rPr>
+              <w:t>componentArrived(), componentFinished()</w:t>
             </w:r>
           </w:p>
         </w:tc>
@@ -1716,14 +1468,12 @@
             </w:tcMar>
           </w:tcPr>
           <w:p>
-            <w:proofErr w:type="spellStart"/>
             <w:r>
               <w:rPr>
                 <w:rFonts w:eastAsia="Calibri" w:cs="Calibri"/>
               </w:rPr>
               <w:t>IncidentCoordinator</w:t>
             </w:r>
-            <w:proofErr w:type="spellEnd"/>
           </w:p>
         </w:tc>
         <w:tc>
@@ -1743,14 +1493,12 @@
             </w:tcMar>
           </w:tcPr>
           <w:p>
-            <w:proofErr w:type="spellStart"/>
             <w:r>
               <w:rPr>
                 <w:rFonts w:eastAsia="Calibri" w:cs="Calibri"/>
               </w:rPr>
               <w:t>ConcreteMediator</w:t>
             </w:r>
-            <w:proofErr w:type="spellEnd"/>
           </w:p>
         </w:tc>
         <w:tc>
@@ -1774,16 +1522,8 @@
               <w:rPr>
                 <w:rFonts w:eastAsia="Calibri" w:cs="Calibri"/>
               </w:rPr>
-              <w:t xml:space="preserve">security, medical, facilities, </w:t>
-            </w:r>
-            <w:proofErr w:type="spellStart"/>
-            <w:r>
-              <w:rPr>
-                <w:rFonts w:eastAsia="Calibri" w:cs="Calibri"/>
-              </w:rPr>
-              <w:t>commChannel</w:t>
-            </w:r>
-            <w:proofErr w:type="spellEnd"/>
+              <w:t>security, medical, facilities, commChannel</w:t>
+            </w:r>
           </w:p>
         </w:tc>
         <w:tc>
@@ -1830,14 +1570,12 @@
             </w:tcMar>
           </w:tcPr>
           <w:p>
-            <w:proofErr w:type="spellStart"/>
             <w:r>
               <w:rPr>
                 <w:rFonts w:eastAsia="Calibri" w:cs="Calibri"/>
               </w:rPr>
               <w:t>ResponseComponent</w:t>
             </w:r>
-            <w:proofErr w:type="spellEnd"/>
           </w:p>
         </w:tc>
         <w:tc>
@@ -1886,21 +1624,7 @@
               <w:rPr>
                 <w:rFonts w:eastAsia="Calibri" w:cs="Calibri"/>
               </w:rPr>
-              <w:t xml:space="preserve">name, mediator, </w:t>
-            </w:r>
-            <w:proofErr w:type="spellStart"/>
-            <w:r>
-              <w:rPr>
-                <w:rFonts w:eastAsia="Calibri" w:cs="Calibri"/>
-              </w:rPr>
-              <w:t>dispatchTo</w:t>
-            </w:r>
-            <w:proofErr w:type="spellEnd"/>
-            <w:r>
-              <w:rPr>
-                <w:rFonts w:eastAsia="Calibri" w:cs="Calibri"/>
-              </w:rPr>
-              <w:t>()</w:t>
+              <w:t>name, mediator, dispatchTo()</w:t>
             </w:r>
           </w:p>
         </w:tc>
@@ -1925,16 +1649,8 @@
               <w:rPr>
                 <w:rFonts w:eastAsia="Calibri" w:cs="Calibri"/>
               </w:rPr>
-              <w:t xml:space="preserve">non-owning reference to </w:t>
-            </w:r>
-            <w:proofErr w:type="spellStart"/>
-            <w:r>
-              <w:rPr>
-                <w:rFonts w:eastAsia="Calibri" w:cs="Calibri"/>
-              </w:rPr>
-              <w:t>ResponseMediator</w:t>
-            </w:r>
-            <w:proofErr w:type="spellEnd"/>
+              <w:t>non-owning reference to ResponseMediator</w:t>
+            </w:r>
           </w:p>
         </w:tc>
       </w:tr>
@@ -1956,42 +1672,12 @@
             </w:tcMar>
           </w:tcPr>
           <w:p>
-            <w:proofErr w:type="spellStart"/>
-            <w:r>
-              <w:rPr>
-                <w:rFonts w:eastAsia="Calibri" w:cs="Calibri"/>
-              </w:rPr>
-              <w:t>SecurityTeam</w:t>
-            </w:r>
-            <w:proofErr w:type="spellEnd"/>
-            <w:r>
-              <w:rPr>
-                <w:rFonts w:eastAsia="Calibri" w:cs="Calibri"/>
-              </w:rPr>
-              <w:t xml:space="preserve"> / </w:t>
-            </w:r>
-            <w:proofErr w:type="spellStart"/>
-            <w:r>
-              <w:rPr>
-                <w:rFonts w:eastAsia="Calibri" w:cs="Calibri"/>
-              </w:rPr>
-              <w:t>MedicalTeam</w:t>
-            </w:r>
-            <w:proofErr w:type="spellEnd"/>
-            <w:r>
-              <w:rPr>
-                <w:rFonts w:eastAsia="Calibri" w:cs="Calibri"/>
-              </w:rPr>
-              <w:t xml:space="preserve"> / </w:t>
-            </w:r>
-            <w:proofErr w:type="spellStart"/>
-            <w:r>
-              <w:rPr>
-                <w:rFonts w:eastAsia="Calibri" w:cs="Calibri"/>
-              </w:rPr>
-              <w:t>FacilitiesTeam</w:t>
-            </w:r>
-            <w:proofErr w:type="spellEnd"/>
+            <w:r>
+              <w:rPr>
+                <w:rFonts w:eastAsia="Calibri" w:cs="Calibri"/>
+              </w:rPr>
+              <w:t>SecurityTeam / MedicalTeam / FacilitiesTeam</w:t>
+            </w:r>
           </w:p>
         </w:tc>
         <w:tc>
@@ -2011,14 +1697,12 @@
             </w:tcMar>
           </w:tcPr>
           <w:p>
-            <w:proofErr w:type="spellStart"/>
             <w:r>
               <w:rPr>
                 <w:rFonts w:eastAsia="Calibri" w:cs="Calibri"/>
               </w:rPr>
               <w:t>ConcreteColleague</w:t>
             </w:r>
-            <w:proofErr w:type="spellEnd"/>
           </w:p>
         </w:tc>
         <w:tc>
@@ -2063,28 +1747,12 @@
             </w:tcMar>
           </w:tcPr>
           <w:p>
-            <w:proofErr w:type="spellStart"/>
-            <w:r>
-              <w:rPr>
-                <w:rFonts w:eastAsia="Calibri" w:cs="Calibri"/>
-              </w:rPr>
-              <w:t>FacilitiesTeam</w:t>
-            </w:r>
-            <w:proofErr w:type="spellEnd"/>
-            <w:r>
-              <w:rPr>
-                <w:rFonts w:eastAsia="Calibri" w:cs="Calibri"/>
-              </w:rPr>
-              <w:t xml:space="preserve"> also references </w:t>
-            </w:r>
-            <w:proofErr w:type="spellStart"/>
-            <w:r>
-              <w:rPr>
-                <w:rFonts w:eastAsia="Calibri" w:cs="Calibri"/>
-              </w:rPr>
-              <w:t>AccessControlSystem</w:t>
-            </w:r>
-            <w:proofErr w:type="spellEnd"/>
+            <w:r>
+              <w:rPr>
+                <w:rFonts w:eastAsia="Calibri" w:cs="Calibri"/>
+              </w:rPr>
+              <w:t>FacilitiesTeam also references AccessControlSystem</w:t>
+            </w:r>
           </w:p>
         </w:tc>
       </w:tr>
@@ -2260,14 +1928,12 @@
             </w:tcMar>
           </w:tcPr>
           <w:p>
-            <w:proofErr w:type="spellStart"/>
             <w:r>
               <w:rPr>
                 <w:rFonts w:eastAsia="Calibri" w:cs="Calibri"/>
               </w:rPr>
               <w:t>CommunicationChannel</w:t>
             </w:r>
-            <w:proofErr w:type="spellEnd"/>
           </w:p>
         </w:tc>
         <w:tc>
@@ -2312,19 +1978,11 @@
             </w:tcMar>
           </w:tcPr>
           <w:p>
-            <w:proofErr w:type="spellStart"/>
-            <w:r>
-              <w:rPr>
-                <w:rFonts w:eastAsia="Calibri" w:cs="Calibri"/>
-              </w:rPr>
-              <w:t>sendAlert</w:t>
-            </w:r>
-            <w:proofErr w:type="spellEnd"/>
-            <w:r>
-              <w:rPr>
-                <w:rFonts w:eastAsia="Calibri" w:cs="Calibri"/>
-              </w:rPr>
-              <w:t>(message, location)</w:t>
+            <w:r>
+              <w:rPr>
+                <w:rFonts w:eastAsia="Calibri" w:cs="Calibri"/>
+              </w:rPr>
+              <w:t>sendAlert(message, location)</w:t>
             </w:r>
           </w:p>
         </w:tc>
@@ -2372,14 +2030,12 @@
             </w:tcMar>
           </w:tcPr>
           <w:p>
-            <w:proofErr w:type="spellStart"/>
             <w:r>
               <w:rPr>
                 <w:rFonts w:eastAsia="Calibri" w:cs="Calibri"/>
               </w:rPr>
               <w:t>LegacyPagerSystem</w:t>
             </w:r>
-            <w:proofErr w:type="spellEnd"/>
           </w:p>
         </w:tc>
         <w:tc>
@@ -2399,14 +2055,12 @@
             </w:tcMar>
           </w:tcPr>
           <w:p>
-            <w:proofErr w:type="spellStart"/>
             <w:r>
               <w:rPr>
                 <w:rFonts w:eastAsia="Calibri" w:cs="Calibri"/>
               </w:rPr>
               <w:t>Adaptee</w:t>
             </w:r>
-            <w:proofErr w:type="spellEnd"/>
           </w:p>
         </w:tc>
         <w:tc>
@@ -2426,33 +2080,11 @@
             </w:tcMar>
           </w:tcPr>
           <w:p>
-            <w:proofErr w:type="spellStart"/>
-            <w:r>
-              <w:rPr>
-                <w:rFonts w:eastAsia="Calibri" w:cs="Calibri"/>
-              </w:rPr>
-              <w:t>broadcastPage</w:t>
-            </w:r>
-            <w:proofErr w:type="spellEnd"/>
-            <w:r>
-              <w:rPr>
-                <w:rFonts w:eastAsia="Calibri" w:cs="Calibri"/>
-              </w:rPr>
-              <w:t xml:space="preserve">(code, </w:t>
-            </w:r>
-            <w:proofErr w:type="spellStart"/>
-            <w:r>
-              <w:rPr>
-                <w:rFonts w:eastAsia="Calibri" w:cs="Calibri"/>
-              </w:rPr>
-              <w:t>zoneId</w:t>
-            </w:r>
-            <w:proofErr w:type="spellEnd"/>
-            <w:r>
-              <w:rPr>
-                <w:rFonts w:eastAsia="Calibri" w:cs="Calibri"/>
-              </w:rPr>
-              <w:t>, payload)</w:t>
+            <w:r>
+              <w:rPr>
+                <w:rFonts w:eastAsia="Calibri" w:cs="Calibri"/>
+              </w:rPr>
+              <w:t>broadcastPage(code, zoneId, payload)</w:t>
             </w:r>
           </w:p>
         </w:tc>
@@ -2500,14 +2132,12 @@
             </w:tcMar>
           </w:tcPr>
           <w:p>
-            <w:proofErr w:type="spellStart"/>
             <w:r>
               <w:rPr>
                 <w:rFonts w:eastAsia="Calibri" w:cs="Calibri"/>
               </w:rPr>
               <w:t>LegacyPagerAdapter</w:t>
             </w:r>
-            <w:proofErr w:type="spellEnd"/>
           </w:p>
         </w:tc>
         <w:tc>
@@ -2552,33 +2182,11 @@
             </w:tcMar>
           </w:tcPr>
           <w:p>
-            <w:proofErr w:type="spellStart"/>
-            <w:r>
-              <w:rPr>
-                <w:rFonts w:eastAsia="Calibri" w:cs="Calibri"/>
-              </w:rPr>
-              <w:t>mapToPriorityCode</w:t>
-            </w:r>
-            <w:proofErr w:type="spellEnd"/>
-            <w:r>
-              <w:rPr>
-                <w:rFonts w:eastAsia="Calibri" w:cs="Calibri"/>
-              </w:rPr>
-              <w:t xml:space="preserve">(), </w:t>
-            </w:r>
-            <w:proofErr w:type="spellStart"/>
-            <w:r>
-              <w:rPr>
-                <w:rFonts w:eastAsia="Calibri" w:cs="Calibri"/>
-              </w:rPr>
-              <w:t>mapToZoneId</w:t>
-            </w:r>
-            <w:proofErr w:type="spellEnd"/>
-            <w:r>
-              <w:rPr>
-                <w:rFonts w:eastAsia="Calibri" w:cs="Calibri"/>
-              </w:rPr>
-              <w:t>()</w:t>
+            <w:r>
+              <w:rPr>
+                <w:rFonts w:eastAsia="Calibri" w:cs="Calibri"/>
+              </w:rPr>
+              <w:t>mapToPriorityCode(), mapToZoneId()</w:t>
             </w:r>
           </w:p>
         </w:tc>
@@ -2603,35 +2211,7 @@
               <w:rPr>
                 <w:rFonts w:eastAsia="Calibri" w:cs="Calibri"/>
               </w:rPr>
-              <w:t xml:space="preserve">owns </w:t>
-            </w:r>
-            <w:proofErr w:type="spellStart"/>
-            <w:r>
-              <w:rPr>
-                <w:rFonts w:eastAsia="Calibri" w:cs="Calibri"/>
-              </w:rPr>
-              <w:t>LegacyPagerSystem</w:t>
-            </w:r>
-            <w:proofErr w:type="spellEnd"/>
-            <w:r>
-              <w:rPr>
-                <w:rFonts w:eastAsia="Calibri" w:cs="Calibri"/>
-              </w:rPr>
-              <w:t xml:space="preserve"> (</w:t>
-            </w:r>
-            <w:proofErr w:type="spellStart"/>
-            <w:r>
-              <w:rPr>
-                <w:rFonts w:eastAsia="Calibri" w:cs="Calibri"/>
-              </w:rPr>
-              <w:t>unique_ptr</w:t>
-            </w:r>
-            <w:proofErr w:type="spellEnd"/>
-            <w:r>
-              <w:rPr>
-                <w:rFonts w:eastAsia="Calibri" w:cs="Calibri"/>
-              </w:rPr>
-              <w:t>)</w:t>
+              <w:t>owns LegacyPagerSystem (unique_ptr)</w:t>
             </w:r>
           </w:p>
         </w:tc>
@@ -2808,14 +2388,12 @@
             </w:tcMar>
           </w:tcPr>
           <w:p>
-            <w:proofErr w:type="spellStart"/>
             <w:r>
               <w:rPr>
                 <w:rFonts w:eastAsia="Calibri" w:cs="Calibri"/>
               </w:rPr>
               <w:t>EmergencyResponseFacade</w:t>
             </w:r>
-            <w:proofErr w:type="spellEnd"/>
           </w:p>
         </w:tc>
         <w:tc>
@@ -2860,19 +2438,11 @@
             </w:tcMar>
           </w:tcPr>
           <w:p>
-            <w:proofErr w:type="spellStart"/>
-            <w:r>
-              <w:rPr>
-                <w:rFonts w:eastAsia="Calibri" w:cs="Calibri"/>
-              </w:rPr>
-              <w:t>reportEmergency</w:t>
-            </w:r>
-            <w:proofErr w:type="spellEnd"/>
-            <w:r>
-              <w:rPr>
-                <w:rFonts w:eastAsia="Calibri" w:cs="Calibri"/>
-              </w:rPr>
-              <w:t>(type, location)</w:t>
+            <w:r>
+              <w:rPr>
+                <w:rFonts w:eastAsia="Calibri" w:cs="Calibri"/>
+              </w:rPr>
+              <w:t>reportEmergency(type, location)</w:t>
             </w:r>
           </w:p>
         </w:tc>
@@ -2897,77 +2467,7 @@
               <w:rPr>
                 <w:rFonts w:eastAsia="Calibri" w:cs="Calibri"/>
               </w:rPr>
-              <w:t xml:space="preserve">owns </w:t>
-            </w:r>
-            <w:proofErr w:type="spellStart"/>
-            <w:r>
-              <w:rPr>
-                <w:rFonts w:eastAsia="Calibri" w:cs="Calibri"/>
-              </w:rPr>
-              <w:t>AccessControlSystem</w:t>
-            </w:r>
-            <w:proofErr w:type="spellEnd"/>
-            <w:r>
-              <w:rPr>
-                <w:rFonts w:eastAsia="Calibri" w:cs="Calibri"/>
-              </w:rPr>
-              <w:t xml:space="preserve">, </w:t>
-            </w:r>
-            <w:proofErr w:type="spellStart"/>
-            <w:r>
-              <w:rPr>
-                <w:rFonts w:eastAsia="Calibri" w:cs="Calibri"/>
-              </w:rPr>
-              <w:t>IncidentCoordinator</w:t>
-            </w:r>
-            <w:proofErr w:type="spellEnd"/>
-            <w:r>
-              <w:rPr>
-                <w:rFonts w:eastAsia="Calibri" w:cs="Calibri"/>
-              </w:rPr>
-              <w:t xml:space="preserve">, all three teams, </w:t>
-            </w:r>
-            <w:proofErr w:type="spellStart"/>
-            <w:r>
-              <w:rPr>
-                <w:rFonts w:eastAsia="Calibri" w:cs="Calibri"/>
-              </w:rPr>
-              <w:t>LegacyPagerAdapter</w:t>
-            </w:r>
-            <w:proofErr w:type="spellEnd"/>
-            <w:r>
-              <w:rPr>
-                <w:rFonts w:eastAsia="Calibri" w:cs="Calibri"/>
-              </w:rPr>
-              <w:t xml:space="preserve">, </w:t>
-            </w:r>
-            <w:proofErr w:type="spellStart"/>
-            <w:r>
-              <w:rPr>
-                <w:rFonts w:eastAsia="Calibri" w:cs="Calibri"/>
-              </w:rPr>
-              <w:t>OperatorConsole</w:t>
-            </w:r>
-            <w:proofErr w:type="spellEnd"/>
-            <w:r>
-              <w:rPr>
-                <w:rFonts w:eastAsia="Calibri" w:cs="Calibri"/>
-              </w:rPr>
-              <w:t xml:space="preserve">, Dashboard, </w:t>
-            </w:r>
-            <w:proofErr w:type="spellStart"/>
-            <w:r>
-              <w:rPr>
-                <w:rFonts w:eastAsia="Calibri" w:cs="Calibri"/>
-              </w:rPr>
-              <w:t>AuditLogger</w:t>
-            </w:r>
-            <w:proofErr w:type="spellEnd"/>
-            <w:r>
-              <w:rPr>
-                <w:rFonts w:eastAsia="Calibri" w:cs="Calibri"/>
-              </w:rPr>
-              <w:t>, and every Incident it creates</w:t>
+              <w:t>owns AccessControlSystem, IncidentCoordinator, all three teams, LegacyPagerAdapter, OperatorConsole, Dashboard, AuditLogger, and every Incident it creates</w:t>
             </w:r>
           </w:p>
         </w:tc>
@@ -2990,14 +2490,12 @@
             </w:tcMar>
           </w:tcPr>
           <w:p>
-            <w:proofErr w:type="spellStart"/>
             <w:r>
               <w:rPr>
                 <w:rFonts w:eastAsia="Calibri" w:cs="Calibri"/>
               </w:rPr>
               <w:t>AccessControlSystem</w:t>
             </w:r>
-            <w:proofErr w:type="spellEnd"/>
           </w:p>
         </w:tc>
         <w:tc>
@@ -3042,47 +2540,11 @@
             </w:tcMar>
           </w:tcPr>
           <w:p>
-            <w:proofErr w:type="spellStart"/>
-            <w:r>
-              <w:rPr>
-                <w:rFonts w:eastAsia="Calibri" w:cs="Calibri"/>
-              </w:rPr>
-              <w:t>lockArea</w:t>
-            </w:r>
-            <w:proofErr w:type="spellEnd"/>
-            <w:r>
-              <w:rPr>
-                <w:rFonts w:eastAsia="Calibri" w:cs="Calibri"/>
-              </w:rPr>
-              <w:t xml:space="preserve">(), </w:t>
-            </w:r>
-            <w:proofErr w:type="spellStart"/>
-            <w:r>
-              <w:rPr>
-                <w:rFonts w:eastAsia="Calibri" w:cs="Calibri"/>
-              </w:rPr>
-              <w:t>unlockArea</w:t>
-            </w:r>
-            <w:proofErr w:type="spellEnd"/>
-            <w:r>
-              <w:rPr>
-                <w:rFonts w:eastAsia="Calibri" w:cs="Calibri"/>
-              </w:rPr>
-              <w:t xml:space="preserve">(), </w:t>
-            </w:r>
-            <w:proofErr w:type="spellStart"/>
-            <w:r>
-              <w:rPr>
-                <w:rFonts w:eastAsia="Calibri" w:cs="Calibri"/>
-              </w:rPr>
-              <w:t>restrictArea</w:t>
-            </w:r>
-            <w:proofErr w:type="spellEnd"/>
-            <w:r>
-              <w:rPr>
-                <w:rFonts w:eastAsia="Calibri" w:cs="Calibri"/>
-              </w:rPr>
-              <w:t>()</w:t>
+            <w:r>
+              <w:rPr>
+                <w:rFonts w:eastAsia="Calibri" w:cs="Calibri"/>
+              </w:rPr>
+              <w:t>lockArea(), unlockArea(), restrictArea()</w:t>
             </w:r>
           </w:p>
         </w:tc>
@@ -3107,30 +2569,8 @@
               <w:rPr>
                 <w:rFonts w:eastAsia="Calibri" w:cs="Calibri"/>
               </w:rPr>
-              <w:t xml:space="preserve">referenced (non-owning) by </w:t>
-            </w:r>
-            <w:proofErr w:type="spellStart"/>
-            <w:r>
-              <w:rPr>
-                <w:rFonts w:eastAsia="Calibri" w:cs="Calibri"/>
-              </w:rPr>
-              <w:t>FacilitiesTeam</w:t>
-            </w:r>
-            <w:proofErr w:type="spellEnd"/>
-            <w:r>
-              <w:rPr>
-                <w:rFonts w:eastAsia="Calibri" w:cs="Calibri"/>
-              </w:rPr>
-              <w:t xml:space="preserve"> and </w:t>
-            </w:r>
-            <w:proofErr w:type="spellStart"/>
-            <w:r>
-              <w:rPr>
-                <w:rFonts w:eastAsia="Calibri" w:cs="Calibri"/>
-              </w:rPr>
-              <w:t>LockAreaCommand</w:t>
-            </w:r>
-            <w:proofErr w:type="spellEnd"/>
+              <w:t>referenced (non-owning) by FacilitiesTeam and LockAreaCommand</w:t>
+            </w:r>
           </w:p>
         </w:tc>
       </w:tr>
@@ -3306,14 +2746,12 @@
             </w:tcMar>
           </w:tcPr>
           <w:p>
-            <w:proofErr w:type="spellStart"/>
             <w:r>
               <w:rPr>
                 <w:rFonts w:eastAsia="Calibri" w:cs="Calibri"/>
               </w:rPr>
               <w:t>IncidentState</w:t>
             </w:r>
-            <w:proofErr w:type="spellEnd"/>
           </w:p>
         </w:tc>
         <w:tc>
@@ -3410,56 +2848,12 @@
             </w:tcMar>
           </w:tcPr>
           <w:p>
-            <w:proofErr w:type="spellStart"/>
-            <w:r>
-              <w:rPr>
-                <w:rFonts w:eastAsia="Calibri" w:cs="Calibri"/>
-              </w:rPr>
-              <w:t>ReportedState</w:t>
-            </w:r>
-            <w:proofErr w:type="spellEnd"/>
-            <w:r>
-              <w:rPr>
-                <w:rFonts w:eastAsia="Calibri" w:cs="Calibri"/>
-              </w:rPr>
-              <w:t xml:space="preserve"> / </w:t>
-            </w:r>
-            <w:proofErr w:type="spellStart"/>
-            <w:r>
-              <w:rPr>
-                <w:rFonts w:eastAsia="Calibri" w:cs="Calibri"/>
-              </w:rPr>
-              <w:t>DispatchedState</w:t>
-            </w:r>
-            <w:proofErr w:type="spellEnd"/>
-            <w:r>
-              <w:rPr>
-                <w:rFonts w:eastAsia="Calibri" w:cs="Calibri"/>
-              </w:rPr>
-              <w:t xml:space="preserve"> / </w:t>
-            </w:r>
-            <w:proofErr w:type="spellStart"/>
-            <w:r>
-              <w:rPr>
-                <w:rFonts w:eastAsia="Calibri" w:cs="Calibri"/>
-              </w:rPr>
-              <w:t>ContainedState</w:t>
-            </w:r>
-            <w:proofErr w:type="spellEnd"/>
-            <w:r>
-              <w:rPr>
-                <w:rFonts w:eastAsia="Calibri" w:cs="Calibri"/>
-              </w:rPr>
-              <w:t xml:space="preserve"> / </w:t>
-            </w:r>
-            <w:proofErr w:type="spellStart"/>
-            <w:r>
-              <w:rPr>
-                <w:rFonts w:eastAsia="Calibri" w:cs="Calibri"/>
-              </w:rPr>
-              <w:t>ResolvedState</w:t>
-            </w:r>
-            <w:proofErr w:type="spellEnd"/>
+            <w:r>
+              <w:rPr>
+                <w:rFonts w:eastAsia="Calibri" w:cs="Calibri"/>
+              </w:rPr>
+              <w:t>ReportedState / DispatchedState / ContainedState / ResolvedState</w:t>
+            </w:r>
           </w:p>
         </w:tc>
         <w:tc>
@@ -3479,14 +2873,12 @@
             </w:tcMar>
           </w:tcPr>
           <w:p>
-            <w:proofErr w:type="spellStart"/>
             <w:r>
               <w:rPr>
                 <w:rFonts w:eastAsia="Calibri" w:cs="Calibri"/>
               </w:rPr>
               <w:t>ConcreteState</w:t>
             </w:r>
-            <w:proofErr w:type="spellEnd"/>
           </w:p>
         </w:tc>
         <w:tc>
@@ -3612,35 +3004,7 @@
               <w:rPr>
                 <w:rFonts w:eastAsia="Calibri" w:cs="Calibri"/>
               </w:rPr>
-              <w:t xml:space="preserve">state: </w:t>
-            </w:r>
-            <w:proofErr w:type="spellStart"/>
-            <w:r>
-              <w:rPr>
-                <w:rFonts w:eastAsia="Calibri" w:cs="Calibri"/>
-              </w:rPr>
-              <w:t>unique_ptr</w:t>
-            </w:r>
-            <w:proofErr w:type="spellEnd"/>
-            <w:r>
-              <w:rPr>
-                <w:rFonts w:eastAsia="Calibri" w:cs="Calibri"/>
-              </w:rPr>
-              <w:t>&lt;</w:t>
-            </w:r>
-            <w:proofErr w:type="spellStart"/>
-            <w:r>
-              <w:rPr>
-                <w:rFonts w:eastAsia="Calibri" w:cs="Calibri"/>
-              </w:rPr>
-              <w:t>IncidentState</w:t>
-            </w:r>
-            <w:proofErr w:type="spellEnd"/>
-            <w:r>
-              <w:rPr>
-                <w:rFonts w:eastAsia="Calibri" w:cs="Calibri"/>
-              </w:rPr>
-              <w:t>&gt;</w:t>
+              <w:t>state: unique_ptr&lt;IncidentState&gt;</w:t>
             </w:r>
           </w:p>
         </w:tc>
@@ -3665,16 +3029,8 @@
               <w:rPr>
                 <w:rFonts w:eastAsia="Calibri" w:cs="Calibri"/>
               </w:rPr>
-              <w:t xml:space="preserve">owns its current </w:t>
-            </w:r>
-            <w:proofErr w:type="spellStart"/>
-            <w:r>
-              <w:rPr>
-                <w:rFonts w:eastAsia="Calibri" w:cs="Calibri"/>
-              </w:rPr>
-              <w:t>IncidentState</w:t>
-            </w:r>
-            <w:proofErr w:type="spellEnd"/>
+              <w:t>owns its current IncidentState</w:t>
+            </w:r>
           </w:p>
         </w:tc>
       </w:tr>
@@ -3956,16 +3312,8 @@
               <w:rPr>
                 <w:rFonts w:eastAsia="Calibri" w:cs="Calibri"/>
               </w:rPr>
-              <w:t xml:space="preserve">Dashboard / </w:t>
-            </w:r>
-            <w:proofErr w:type="spellStart"/>
-            <w:r>
-              <w:rPr>
-                <w:rFonts w:eastAsia="Calibri" w:cs="Calibri"/>
-              </w:rPr>
-              <w:t>AuditLogger</w:t>
-            </w:r>
-            <w:proofErr w:type="spellEnd"/>
+              <w:t>Dashboard / AuditLogger</w:t>
+            </w:r>
           </w:p>
         </w:tc>
         <w:tc>
@@ -3985,14 +3333,12 @@
             </w:tcMar>
           </w:tcPr>
           <w:p>
-            <w:proofErr w:type="spellStart"/>
             <w:r>
               <w:rPr>
                 <w:rFonts w:eastAsia="Calibri" w:cs="Calibri"/>
               </w:rPr>
               <w:t>ConcreteObserver</w:t>
             </w:r>
-            <w:proofErr w:type="spellEnd"/>
           </w:p>
         </w:tc>
         <w:tc>
@@ -4172,15 +3518,7 @@
         <w:t>1.</w:t>
       </w:r>
       <w:r>
-        <w:t xml:space="preserve">3. </w:t>
-      </w:r>
-      <w:proofErr w:type="spellStart"/>
-      <w:r>
-        <w:t>GoF</w:t>
-      </w:r>
-      <w:proofErr w:type="spellEnd"/>
-      <w:r>
-        <w:t xml:space="preserve"> Participant Mapping</w:t>
+        <w:t>3. GoF Participant Mapping</w:t>
       </w:r>
     </w:p>
     <w:tbl>
@@ -4410,14 +3748,12 @@
             </w:tcMar>
           </w:tcPr>
           <w:p>
-            <w:proofErr w:type="spellStart"/>
             <w:r>
               <w:rPr>
                 <w:rFonts w:eastAsia="Calibri" w:cs="Calibri"/>
               </w:rPr>
               <w:t>ConcreteCommand</w:t>
             </w:r>
-            <w:proofErr w:type="spellEnd"/>
           </w:p>
         </w:tc>
         <w:tc>
@@ -4437,70 +3773,12 @@
             </w:tcMar>
           </w:tcPr>
           <w:p>
-            <w:proofErr w:type="spellStart"/>
-            <w:r>
-              <w:rPr>
-                <w:rFonts w:eastAsia="Calibri" w:cs="Calibri"/>
-              </w:rPr>
-              <w:t>DispatchUnitCommand</w:t>
-            </w:r>
-            <w:proofErr w:type="spellEnd"/>
-            <w:r>
-              <w:rPr>
-                <w:rFonts w:eastAsia="Calibri" w:cs="Calibri"/>
-              </w:rPr>
-              <w:t xml:space="preserve">, </w:t>
-            </w:r>
-            <w:proofErr w:type="spellStart"/>
-            <w:r>
-              <w:rPr>
-                <w:rFonts w:eastAsia="Calibri" w:cs="Calibri"/>
-              </w:rPr>
-              <w:t>LockAreaCommand</w:t>
-            </w:r>
-            <w:proofErr w:type="spellEnd"/>
-            <w:r>
-              <w:rPr>
-                <w:rFonts w:eastAsia="Calibri" w:cs="Calibri"/>
-              </w:rPr>
-              <w:t xml:space="preserve">, </w:t>
-            </w:r>
-            <w:proofErr w:type="spellStart"/>
-            <w:r>
-              <w:rPr>
-                <w:rFonts w:eastAsia="Calibri" w:cs="Calibri"/>
-              </w:rPr>
-              <w:t>AlertCommand</w:t>
-            </w:r>
-            <w:proofErr w:type="spellEnd"/>
-            <w:r>
-              <w:rPr>
-                <w:rFonts w:eastAsia="Calibri" w:cs="Calibri"/>
-              </w:rPr>
-              <w:t xml:space="preserve">, </w:t>
-            </w:r>
-            <w:proofErr w:type="spellStart"/>
-            <w:r>
-              <w:rPr>
-                <w:rFonts w:eastAsia="Calibri" w:cs="Calibri"/>
-              </w:rPr>
-              <w:t>EvacuationCommand</w:t>
-            </w:r>
-            <w:proofErr w:type="spellEnd"/>
-            <w:r>
-              <w:rPr>
-                <w:rFonts w:eastAsia="Calibri" w:cs="Calibri"/>
-              </w:rPr>
-              <w:t xml:space="preserve">, </w:t>
-            </w:r>
-            <w:proofErr w:type="spellStart"/>
-            <w:r>
-              <w:rPr>
-                <w:rFonts w:eastAsia="Calibri" w:cs="Calibri"/>
-              </w:rPr>
-              <w:t>CancelCommand</w:t>
-            </w:r>
-            <w:proofErr w:type="spellEnd"/>
+            <w:r>
+              <w:rPr>
+                <w:rFonts w:eastAsia="Calibri" w:cs="Calibri"/>
+              </w:rPr>
+              <w:t>DispatchUnitCommand, LockAreaCommand, AlertCommand, EvacuationCommand, CancelCommand</w:t>
+            </w:r>
           </w:p>
         </w:tc>
       </w:tr>
@@ -4565,14 +3843,12 @@
             </w:tcMar>
           </w:tcPr>
           <w:p>
-            <w:proofErr w:type="spellStart"/>
             <w:r>
               <w:rPr>
                 <w:rFonts w:eastAsia="Calibri" w:cs="Calibri"/>
               </w:rPr>
               <w:t>OperatorConsole</w:t>
             </w:r>
-            <w:proofErr w:type="spellEnd"/>
           </w:p>
         </w:tc>
       </w:tr>
@@ -4637,61 +3913,11 @@
             </w:tcMar>
           </w:tcPr>
           <w:p>
-            <w:proofErr w:type="spellStart"/>
-            <w:r>
-              <w:rPr>
-                <w:rFonts w:eastAsia="Calibri" w:cs="Calibri"/>
-              </w:rPr>
-              <w:t>ResponseComponent</w:t>
-            </w:r>
-            <w:proofErr w:type="spellEnd"/>
-            <w:r>
-              <w:rPr>
-                <w:rFonts w:eastAsia="Calibri" w:cs="Calibri"/>
-              </w:rPr>
-              <w:t xml:space="preserve"> subclasses, </w:t>
-            </w:r>
-            <w:proofErr w:type="spellStart"/>
-            <w:r>
-              <w:rPr>
-                <w:rFonts w:eastAsia="Calibri" w:cs="Calibri"/>
-              </w:rPr>
-              <w:t>AccessControlSystem</w:t>
-            </w:r>
-            <w:proofErr w:type="spellEnd"/>
-            <w:r>
-              <w:rPr>
-                <w:rFonts w:eastAsia="Calibri" w:cs="Calibri"/>
-              </w:rPr>
-              <w:t xml:space="preserve">, </w:t>
-            </w:r>
-            <w:proofErr w:type="spellStart"/>
-            <w:r>
-              <w:rPr>
-                <w:rFonts w:eastAsia="Calibri" w:cs="Calibri"/>
-              </w:rPr>
-              <w:t>CommunicationChannel</w:t>
-            </w:r>
-            <w:proofErr w:type="spellEnd"/>
-            <w:r>
-              <w:rPr>
-                <w:rFonts w:eastAsia="Calibri" w:cs="Calibri"/>
-              </w:rPr>
-              <w:t xml:space="preserve">, another Command (for </w:t>
-            </w:r>
-            <w:proofErr w:type="spellStart"/>
-            <w:r>
-              <w:rPr>
-                <w:rFonts w:eastAsia="Calibri" w:cs="Calibri"/>
-              </w:rPr>
-              <w:t>CancelCommand</w:t>
-            </w:r>
-            <w:proofErr w:type="spellEnd"/>
-            <w:r>
-              <w:rPr>
-                <w:rFonts w:eastAsia="Calibri" w:cs="Calibri"/>
-              </w:rPr>
-              <w:t>)</w:t>
+            <w:r>
+              <w:rPr>
+                <w:rFonts w:eastAsia="Calibri" w:cs="Calibri"/>
+              </w:rPr>
+              <w:t>ResponseComponent subclasses, AccessControlSystem, CommunicationChannel, another Command (for CancelCommand)</w:t>
             </w:r>
           </w:p>
         </w:tc>
@@ -4764,19 +3990,11 @@
             </w:tcMar>
           </w:tcPr>
           <w:p>
-            <w:proofErr w:type="spellStart"/>
-            <w:r>
-              <w:rPr>
-                <w:rFonts w:eastAsia="Calibri" w:cs="Calibri"/>
-              </w:rPr>
-              <w:t>ResponseMediator</w:t>
-            </w:r>
-            <w:proofErr w:type="spellEnd"/>
-            <w:r>
-              <w:rPr>
-                <w:rFonts w:eastAsia="Calibri" w:cs="Calibri"/>
-              </w:rPr>
-              <w:t xml:space="preserve"> (interface)</w:t>
+            <w:r>
+              <w:rPr>
+                <w:rFonts w:eastAsia="Calibri" w:cs="Calibri"/>
+              </w:rPr>
+              <w:t>ResponseMediator (interface)</w:t>
             </w:r>
           </w:p>
         </w:tc>
@@ -4817,14 +4035,12 @@
             </w:tcMar>
           </w:tcPr>
           <w:p>
-            <w:proofErr w:type="spellStart"/>
             <w:r>
               <w:rPr>
                 <w:rFonts w:eastAsia="Calibri" w:cs="Calibri"/>
               </w:rPr>
               <w:t>ConcreteMediator</w:t>
             </w:r>
-            <w:proofErr w:type="spellEnd"/>
           </w:p>
         </w:tc>
         <w:tc>
@@ -4844,14 +4060,12 @@
             </w:tcMar>
           </w:tcPr>
           <w:p>
-            <w:proofErr w:type="spellStart"/>
             <w:r>
               <w:rPr>
                 <w:rFonts w:eastAsia="Calibri" w:cs="Calibri"/>
               </w:rPr>
               <w:t>IncidentCoordinator</w:t>
             </w:r>
-            <w:proofErr w:type="spellEnd"/>
           </w:p>
         </w:tc>
       </w:tr>
@@ -4916,19 +4130,11 @@
             </w:tcMar>
           </w:tcPr>
           <w:p>
-            <w:proofErr w:type="spellStart"/>
-            <w:r>
-              <w:rPr>
-                <w:rFonts w:eastAsia="Calibri" w:cs="Calibri"/>
-              </w:rPr>
-              <w:t>ResponseComponent</w:t>
-            </w:r>
-            <w:proofErr w:type="spellEnd"/>
-            <w:r>
-              <w:rPr>
-                <w:rFonts w:eastAsia="Calibri" w:cs="Calibri"/>
-              </w:rPr>
-              <w:t xml:space="preserve"> (abstract)</w:t>
+            <w:r>
+              <w:rPr>
+                <w:rFonts w:eastAsia="Calibri" w:cs="Calibri"/>
+              </w:rPr>
+              <w:t>ResponseComponent (abstract)</w:t>
             </w:r>
           </w:p>
         </w:tc>
@@ -4969,14 +4175,12 @@
             </w:tcMar>
           </w:tcPr>
           <w:p>
-            <w:proofErr w:type="spellStart"/>
             <w:r>
               <w:rPr>
                 <w:rFonts w:eastAsia="Calibri" w:cs="Calibri"/>
               </w:rPr>
               <w:t>ConcreteColleague</w:t>
             </w:r>
-            <w:proofErr w:type="spellEnd"/>
           </w:p>
         </w:tc>
         <w:tc>
@@ -4996,42 +4200,12 @@
             </w:tcMar>
           </w:tcPr>
           <w:p>
-            <w:proofErr w:type="spellStart"/>
-            <w:r>
-              <w:rPr>
-                <w:rFonts w:eastAsia="Calibri" w:cs="Calibri"/>
-              </w:rPr>
-              <w:t>SecurityTeam</w:t>
-            </w:r>
-            <w:proofErr w:type="spellEnd"/>
-            <w:r>
-              <w:rPr>
-                <w:rFonts w:eastAsia="Calibri" w:cs="Calibri"/>
-              </w:rPr>
-              <w:t xml:space="preserve">, </w:t>
-            </w:r>
-            <w:proofErr w:type="spellStart"/>
-            <w:r>
-              <w:rPr>
-                <w:rFonts w:eastAsia="Calibri" w:cs="Calibri"/>
-              </w:rPr>
-              <w:t>MedicalTeam</w:t>
-            </w:r>
-            <w:proofErr w:type="spellEnd"/>
-            <w:r>
-              <w:rPr>
-                <w:rFonts w:eastAsia="Calibri" w:cs="Calibri"/>
-              </w:rPr>
-              <w:t xml:space="preserve">, </w:t>
-            </w:r>
-            <w:proofErr w:type="spellStart"/>
-            <w:r>
-              <w:rPr>
-                <w:rFonts w:eastAsia="Calibri" w:cs="Calibri"/>
-              </w:rPr>
-              <w:t>FacilitiesTeam</w:t>
-            </w:r>
-            <w:proofErr w:type="spellEnd"/>
+            <w:r>
+              <w:rPr>
+                <w:rFonts w:eastAsia="Calibri" w:cs="Calibri"/>
+              </w:rPr>
+              <w:t>SecurityTeam, MedicalTeam, FacilitiesTeam</w:t>
+            </w:r>
           </w:p>
         </w:tc>
       </w:tr>
@@ -5103,14 +4277,12 @@
             </w:tcMar>
           </w:tcPr>
           <w:p>
-            <w:proofErr w:type="spellStart"/>
             <w:r>
               <w:rPr>
                 <w:rFonts w:eastAsia="Calibri" w:cs="Calibri"/>
               </w:rPr>
               <w:t>CommunicationChannel</w:t>
             </w:r>
-            <w:proofErr w:type="spellEnd"/>
           </w:p>
         </w:tc>
       </w:tr>
@@ -5150,14 +4322,12 @@
             </w:tcMar>
           </w:tcPr>
           <w:p>
-            <w:proofErr w:type="spellStart"/>
             <w:r>
               <w:rPr>
                 <w:rFonts w:eastAsia="Calibri" w:cs="Calibri"/>
               </w:rPr>
               <w:t>Adaptee</w:t>
             </w:r>
-            <w:proofErr w:type="spellEnd"/>
           </w:p>
         </w:tc>
         <w:tc>
@@ -5177,14 +4347,12 @@
             </w:tcMar>
           </w:tcPr>
           <w:p>
-            <w:proofErr w:type="spellStart"/>
             <w:r>
               <w:rPr>
                 <w:rFonts w:eastAsia="Calibri" w:cs="Calibri"/>
               </w:rPr>
               <w:t>LegacyPagerSystem</w:t>
             </w:r>
-            <w:proofErr w:type="spellEnd"/>
           </w:p>
         </w:tc>
       </w:tr>
@@ -5249,19 +4417,11 @@
             </w:tcMar>
           </w:tcPr>
           <w:p>
-            <w:proofErr w:type="spellStart"/>
-            <w:r>
-              <w:rPr>
-                <w:rFonts w:eastAsia="Calibri" w:cs="Calibri"/>
-              </w:rPr>
-              <w:t>LegacyPagerAdapter</w:t>
-            </w:r>
-            <w:proofErr w:type="spellEnd"/>
-            <w:r>
-              <w:rPr>
-                <w:rFonts w:eastAsia="Calibri" w:cs="Calibri"/>
-              </w:rPr>
-              <w:t xml:space="preserve"> (object adapter, composition-based)</w:t>
+            <w:r>
+              <w:rPr>
+                <w:rFonts w:eastAsia="Calibri" w:cs="Calibri"/>
+              </w:rPr>
+              <w:t>LegacyPagerAdapter (object adapter, composition-based)</w:t>
             </w:r>
           </w:p>
         </w:tc>
@@ -5334,14 +4494,12 @@
             </w:tcMar>
           </w:tcPr>
           <w:p>
-            <w:proofErr w:type="spellStart"/>
             <w:r>
               <w:rPr>
                 <w:rFonts w:eastAsia="Calibri" w:cs="Calibri"/>
               </w:rPr>
               <w:t>EmergencyResponseFacade</w:t>
             </w:r>
-            <w:proofErr w:type="spellEnd"/>
           </w:p>
         </w:tc>
       </w:tr>
@@ -5406,98 +4564,12 @@
             </w:tcMar>
           </w:tcPr>
           <w:p>
-            <w:proofErr w:type="spellStart"/>
-            <w:r>
-              <w:rPr>
-                <w:rFonts w:eastAsia="Calibri" w:cs="Calibri"/>
-              </w:rPr>
-              <w:t>AccessControlSystem</w:t>
-            </w:r>
-            <w:proofErr w:type="spellEnd"/>
-            <w:r>
-              <w:rPr>
-                <w:rFonts w:eastAsia="Calibri" w:cs="Calibri"/>
-              </w:rPr>
-              <w:t xml:space="preserve">, </w:t>
-            </w:r>
-            <w:proofErr w:type="spellStart"/>
-            <w:r>
-              <w:rPr>
-                <w:rFonts w:eastAsia="Calibri" w:cs="Calibri"/>
-              </w:rPr>
-              <w:t>IncidentCoordinator</w:t>
-            </w:r>
-            <w:proofErr w:type="spellEnd"/>
-            <w:r>
-              <w:rPr>
-                <w:rFonts w:eastAsia="Calibri" w:cs="Calibri"/>
-              </w:rPr>
-              <w:t xml:space="preserve">, </w:t>
-            </w:r>
-            <w:proofErr w:type="spellStart"/>
-            <w:r>
-              <w:rPr>
-                <w:rFonts w:eastAsia="Calibri" w:cs="Calibri"/>
-              </w:rPr>
-              <w:t>SecurityTeam</w:t>
-            </w:r>
-            <w:proofErr w:type="spellEnd"/>
-            <w:r>
-              <w:rPr>
-                <w:rFonts w:eastAsia="Calibri" w:cs="Calibri"/>
-              </w:rPr>
-              <w:t xml:space="preserve">, </w:t>
-            </w:r>
-            <w:proofErr w:type="spellStart"/>
-            <w:r>
-              <w:rPr>
-                <w:rFonts w:eastAsia="Calibri" w:cs="Calibri"/>
-              </w:rPr>
-              <w:t>MedicalTeam</w:t>
-            </w:r>
-            <w:proofErr w:type="spellEnd"/>
-            <w:r>
-              <w:rPr>
-                <w:rFonts w:eastAsia="Calibri" w:cs="Calibri"/>
-              </w:rPr>
-              <w:t xml:space="preserve">, </w:t>
-            </w:r>
-            <w:proofErr w:type="spellStart"/>
-            <w:r>
-              <w:rPr>
-                <w:rFonts w:eastAsia="Calibri" w:cs="Calibri"/>
-              </w:rPr>
-              <w:t>FacilitiesTeam</w:t>
-            </w:r>
-            <w:proofErr w:type="spellEnd"/>
-            <w:r>
-              <w:rPr>
-                <w:rFonts w:eastAsia="Calibri" w:cs="Calibri"/>
-              </w:rPr>
-              <w:t xml:space="preserve">, </w:t>
-            </w:r>
-            <w:proofErr w:type="spellStart"/>
-            <w:r>
-              <w:rPr>
-                <w:rFonts w:eastAsia="Calibri" w:cs="Calibri"/>
-              </w:rPr>
-              <w:t>LegacyPagerAdapter</w:t>
-            </w:r>
-            <w:proofErr w:type="spellEnd"/>
-            <w:r>
-              <w:rPr>
-                <w:rFonts w:eastAsia="Calibri" w:cs="Calibri"/>
-              </w:rPr>
-              <w:t xml:space="preserve">, </w:t>
-            </w:r>
-            <w:proofErr w:type="spellStart"/>
-            <w:r>
-              <w:rPr>
-                <w:rFonts w:eastAsia="Calibri" w:cs="Calibri"/>
-              </w:rPr>
-              <w:t>OperatorConsole</w:t>
-            </w:r>
-            <w:proofErr w:type="spellEnd"/>
+            <w:r>
+              <w:rPr>
+                <w:rFonts w:eastAsia="Calibri" w:cs="Calibri"/>
+              </w:rPr>
+              <w:t>AccessControlSystem, IncidentCoordinator, SecurityTeam, MedicalTeam, FacilitiesTeam, LegacyPagerAdapter, OperatorConsole</w:t>
+            </w:r>
           </w:p>
         </w:tc>
       </w:tr>
@@ -5639,14 +4711,12 @@
             </w:tcMar>
           </w:tcPr>
           <w:p>
-            <w:proofErr w:type="spellStart"/>
             <w:r>
               <w:rPr>
                 <w:rFonts w:eastAsia="Calibri" w:cs="Calibri"/>
               </w:rPr>
               <w:t>IncidentState</w:t>
             </w:r>
-            <w:proofErr w:type="spellEnd"/>
           </w:p>
         </w:tc>
       </w:tr>
@@ -5686,14 +4756,12 @@
             </w:tcMar>
           </w:tcPr>
           <w:p>
-            <w:proofErr w:type="spellStart"/>
             <w:r>
               <w:rPr>
                 <w:rFonts w:eastAsia="Calibri" w:cs="Calibri"/>
               </w:rPr>
               <w:t>ConcreteState</w:t>
             </w:r>
-            <w:proofErr w:type="spellEnd"/>
           </w:p>
         </w:tc>
         <w:tc>
@@ -5713,56 +4781,12 @@
             </w:tcMar>
           </w:tcPr>
           <w:p>
-            <w:proofErr w:type="spellStart"/>
-            <w:r>
-              <w:rPr>
-                <w:rFonts w:eastAsia="Calibri" w:cs="Calibri"/>
-              </w:rPr>
-              <w:t>ReportedState</w:t>
-            </w:r>
-            <w:proofErr w:type="spellEnd"/>
-            <w:r>
-              <w:rPr>
-                <w:rFonts w:eastAsia="Calibri" w:cs="Calibri"/>
-              </w:rPr>
-              <w:t xml:space="preserve">, </w:t>
-            </w:r>
-            <w:proofErr w:type="spellStart"/>
-            <w:r>
-              <w:rPr>
-                <w:rFonts w:eastAsia="Calibri" w:cs="Calibri"/>
-              </w:rPr>
-              <w:t>DispatchedState</w:t>
-            </w:r>
-            <w:proofErr w:type="spellEnd"/>
-            <w:r>
-              <w:rPr>
-                <w:rFonts w:eastAsia="Calibri" w:cs="Calibri"/>
-              </w:rPr>
-              <w:t xml:space="preserve">, </w:t>
-            </w:r>
-            <w:proofErr w:type="spellStart"/>
-            <w:r>
-              <w:rPr>
-                <w:rFonts w:eastAsia="Calibri" w:cs="Calibri"/>
-              </w:rPr>
-              <w:t>ContainedState</w:t>
-            </w:r>
-            <w:proofErr w:type="spellEnd"/>
-            <w:r>
-              <w:rPr>
-                <w:rFonts w:eastAsia="Calibri" w:cs="Calibri"/>
-              </w:rPr>
-              <w:t xml:space="preserve">, </w:t>
-            </w:r>
-            <w:proofErr w:type="spellStart"/>
-            <w:r>
-              <w:rPr>
-                <w:rFonts w:eastAsia="Calibri" w:cs="Calibri"/>
-              </w:rPr>
-              <w:t>ResolvedState</w:t>
-            </w:r>
-            <w:proofErr w:type="spellEnd"/>
+            <w:r>
+              <w:rPr>
+                <w:rFonts w:eastAsia="Calibri" w:cs="Calibri"/>
+              </w:rPr>
+              <w:t>ReportedState, DispatchedState, ContainedState, ResolvedState</w:t>
+            </w:r>
           </w:p>
         </w:tc>
       </w:tr>
@@ -5949,14 +4973,12 @@
             </w:tcMar>
           </w:tcPr>
           <w:p>
-            <w:proofErr w:type="spellStart"/>
             <w:r>
               <w:rPr>
                 <w:rFonts w:eastAsia="Calibri" w:cs="Calibri"/>
               </w:rPr>
               <w:t>ConcreteObserver</w:t>
             </w:r>
-            <w:proofErr w:type="spellEnd"/>
           </w:p>
         </w:tc>
         <w:tc>
@@ -5980,16 +5002,8 @@
               <w:rPr>
                 <w:rFonts w:eastAsia="Calibri" w:cs="Calibri"/>
               </w:rPr>
-              <w:t xml:space="preserve">Dashboard, </w:t>
-            </w:r>
-            <w:proofErr w:type="spellStart"/>
-            <w:r>
-              <w:rPr>
-                <w:rFonts w:eastAsia="Calibri" w:cs="Calibri"/>
-              </w:rPr>
-              <w:t>AuditLogger</w:t>
-            </w:r>
-            <w:proofErr w:type="spellEnd"/>
+              <w:t>Dashboard, AuditLogger</w:t>
+            </w:r>
           </w:p>
         </w:tc>
       </w:tr>
@@ -6085,39 +5099,7 @@
           <w:rFonts w:eastAsia="Calibri" w:cs="Calibri"/>
           <w:szCs w:val="22"/>
         </w:rPr>
-        <w:t xml:space="preserve">Having Incident directly call </w:t>
-      </w:r>
-      <w:proofErr w:type="spellStart"/>
-      <w:r>
-        <w:rPr>
-          <w:rFonts w:eastAsia="Calibri" w:cs="Calibri"/>
-          <w:szCs w:val="22"/>
-        </w:rPr>
-        <w:t>dashboard.update</w:t>
-      </w:r>
-      <w:proofErr w:type="spellEnd"/>
-      <w:r>
-        <w:rPr>
-          <w:rFonts w:eastAsia="Calibri" w:cs="Calibri"/>
-          <w:szCs w:val="22"/>
-        </w:rPr>
-        <w:t xml:space="preserve">() and </w:t>
-      </w:r>
-      <w:proofErr w:type="spellStart"/>
-      <w:r>
-        <w:rPr>
-          <w:rFonts w:eastAsia="Calibri" w:cs="Calibri"/>
-          <w:szCs w:val="22"/>
-        </w:rPr>
-        <w:t>logger.log</w:t>
-      </w:r>
-      <w:proofErr w:type="spellEnd"/>
-      <w:r>
-        <w:rPr>
-          <w:rFonts w:eastAsia="Calibri" w:cs="Calibri"/>
-          <w:szCs w:val="22"/>
-        </w:rPr>
-        <w:t>() inline would work initially, but couples Incident to concrete reporting classes and requires editing Incident every time a new consumer of status changes is added</w:t>
+        <w:t>Having Incident directly call dashboard.update() and logger.log() inline would work initially, but couples Incident to concrete reporting classes and requires editing Incident every time a new consumer of status changes is added</w:t>
       </w:r>
       <w:r>
         <w:rPr>
@@ -6225,9 +5207,28 @@
                 <w:bCs/>
                 <w:color w:val="FFFFFF"/>
               </w:rPr>
-              <w:t xml:space="preserve">Owns (via </w:t>
-            </w:r>
-            <w:proofErr w:type="spellStart"/>
+              <w:t>Owns (via unique_ptr)</w:t>
+            </w:r>
+          </w:p>
+        </w:tc>
+        <w:tc>
+          <w:tcPr>
+            <w:tcW w:w="4600" w:type="dxa"/>
+            <w:tcBorders>
+              <w:top w:val="single" w:sz="2" w:space="0" w:color="BFBFBF"/>
+              <w:left w:val="single" w:sz="2" w:space="0" w:color="BFBFBF"/>
+              <w:bottom w:val="single" w:sz="2" w:space="0" w:color="BFBFBF"/>
+              <w:right w:val="single" w:sz="2" w:space="0" w:color="BFBFBF"/>
+            </w:tcBorders>
+            <w:shd w:val="clear" w:color="auto" w:fill="2F5496"/>
+            <w:tcMar>
+              <w:top w:w="80" w:type="dxa"/>
+              <w:left w:w="100" w:type="dxa"/>
+              <w:bottom w:w="80" w:type="dxa"/>
+              <w:right w:w="100" w:type="dxa"/>
+            </w:tcMar>
+          </w:tcPr>
+          <w:p>
             <w:r>
               <w:rPr>
                 <w:rFonts w:eastAsia="Calibri" w:cs="Calibri"/>
@@ -6235,45 +5236,6 @@
                 <w:bCs/>
                 <w:color w:val="FFFFFF"/>
               </w:rPr>
-              <w:t>unique_ptr</w:t>
-            </w:r>
-            <w:proofErr w:type="spellEnd"/>
-            <w:r>
-              <w:rPr>
-                <w:rFonts w:eastAsia="Calibri" w:cs="Calibri"/>
-                <w:b/>
-                <w:bCs/>
-                <w:color w:val="FFFFFF"/>
-              </w:rPr>
-              <w:t>)</w:t>
-            </w:r>
-          </w:p>
-        </w:tc>
-        <w:tc>
-          <w:tcPr>
-            <w:tcW w:w="4600" w:type="dxa"/>
-            <w:tcBorders>
-              <w:top w:val="single" w:sz="2" w:space="0" w:color="BFBFBF"/>
-              <w:left w:val="single" w:sz="2" w:space="0" w:color="BFBFBF"/>
-              <w:bottom w:val="single" w:sz="2" w:space="0" w:color="BFBFBF"/>
-              <w:right w:val="single" w:sz="2" w:space="0" w:color="BFBFBF"/>
-            </w:tcBorders>
-            <w:shd w:val="clear" w:color="auto" w:fill="2F5496"/>
-            <w:tcMar>
-              <w:top w:w="80" w:type="dxa"/>
-              <w:left w:w="100" w:type="dxa"/>
-              <w:bottom w:w="80" w:type="dxa"/>
-              <w:right w:w="100" w:type="dxa"/>
-            </w:tcMar>
-          </w:tcPr>
-          <w:p>
-            <w:r>
-              <w:rPr>
-                <w:rFonts w:eastAsia="Calibri" w:cs="Calibri"/>
-                <w:b/>
-                <w:bCs/>
-                <w:color w:val="FFFFFF"/>
-              </w:rPr>
               <w:t>Rationale</w:t>
             </w:r>
           </w:p>
@@ -6297,14 +5259,12 @@
             </w:tcMar>
           </w:tcPr>
           <w:p>
-            <w:proofErr w:type="spellStart"/>
             <w:r>
               <w:rPr>
                 <w:rFonts w:eastAsia="Calibri" w:cs="Calibri"/>
               </w:rPr>
               <w:t>EmergencyResponseFacade</w:t>
             </w:r>
-            <w:proofErr w:type="spellEnd"/>
           </w:p>
         </w:tc>
         <w:tc>
@@ -6324,117 +5284,11 @@
             </w:tcMar>
           </w:tcPr>
           <w:p>
-            <w:proofErr w:type="spellStart"/>
-            <w:r>
-              <w:rPr>
-                <w:rFonts w:eastAsia="Calibri" w:cs="Calibri"/>
-              </w:rPr>
-              <w:t>AccessControlSystem</w:t>
-            </w:r>
-            <w:proofErr w:type="spellEnd"/>
-            <w:r>
-              <w:rPr>
-                <w:rFonts w:eastAsia="Calibri" w:cs="Calibri"/>
-              </w:rPr>
-              <w:t xml:space="preserve">, </w:t>
-            </w:r>
-            <w:proofErr w:type="spellStart"/>
-            <w:r>
-              <w:rPr>
-                <w:rFonts w:eastAsia="Calibri" w:cs="Calibri"/>
-              </w:rPr>
-              <w:t>IncidentCoordinator</w:t>
-            </w:r>
-            <w:proofErr w:type="spellEnd"/>
-            <w:r>
-              <w:rPr>
-                <w:rFonts w:eastAsia="Calibri" w:cs="Calibri"/>
-              </w:rPr>
-              <w:t xml:space="preserve">, </w:t>
-            </w:r>
-            <w:proofErr w:type="spellStart"/>
-            <w:r>
-              <w:rPr>
-                <w:rFonts w:eastAsia="Calibri" w:cs="Calibri"/>
-              </w:rPr>
-              <w:t>SecurityTeam</w:t>
-            </w:r>
-            <w:proofErr w:type="spellEnd"/>
-            <w:r>
-              <w:rPr>
-                <w:rFonts w:eastAsia="Calibri" w:cs="Calibri"/>
-              </w:rPr>
-              <w:t xml:space="preserve">, </w:t>
-            </w:r>
-            <w:proofErr w:type="spellStart"/>
-            <w:r>
-              <w:rPr>
-                <w:rFonts w:eastAsia="Calibri" w:cs="Calibri"/>
-              </w:rPr>
-              <w:t>MedicalTeam</w:t>
-            </w:r>
-            <w:proofErr w:type="spellEnd"/>
-            <w:r>
-              <w:rPr>
-                <w:rFonts w:eastAsia="Calibri" w:cs="Calibri"/>
-              </w:rPr>
-              <w:t xml:space="preserve">, </w:t>
-            </w:r>
-            <w:proofErr w:type="spellStart"/>
-            <w:r>
-              <w:rPr>
-                <w:rFonts w:eastAsia="Calibri" w:cs="Calibri"/>
-              </w:rPr>
-              <w:t>FacilitiesTeam</w:t>
-            </w:r>
-            <w:proofErr w:type="spellEnd"/>
-            <w:r>
-              <w:rPr>
-                <w:rFonts w:eastAsia="Calibri" w:cs="Calibri"/>
-              </w:rPr>
-              <w:t xml:space="preserve">, </w:t>
-            </w:r>
-            <w:proofErr w:type="spellStart"/>
-            <w:r>
-              <w:rPr>
-                <w:rFonts w:eastAsia="Calibri" w:cs="Calibri"/>
-              </w:rPr>
-              <w:t>LegacyPagerAdapter</w:t>
-            </w:r>
-            <w:proofErr w:type="spellEnd"/>
-            <w:r>
-              <w:rPr>
-                <w:rFonts w:eastAsia="Calibri" w:cs="Calibri"/>
-              </w:rPr>
-              <w:t xml:space="preserve">, </w:t>
-            </w:r>
-            <w:proofErr w:type="spellStart"/>
-            <w:r>
-              <w:rPr>
-                <w:rFonts w:eastAsia="Calibri" w:cs="Calibri"/>
-              </w:rPr>
-              <w:t>OperatorConsole</w:t>
-            </w:r>
-            <w:proofErr w:type="spellEnd"/>
-            <w:r>
-              <w:rPr>
-                <w:rFonts w:eastAsia="Calibri" w:cs="Calibri"/>
-              </w:rPr>
-              <w:t xml:space="preserve">, Dashboard, </w:t>
-            </w:r>
-            <w:proofErr w:type="spellStart"/>
-            <w:r>
-              <w:rPr>
-                <w:rFonts w:eastAsia="Calibri" w:cs="Calibri"/>
-              </w:rPr>
-              <w:t>AuditLogger</w:t>
-            </w:r>
-            <w:proofErr w:type="spellEnd"/>
-            <w:r>
-              <w:rPr>
-                <w:rFonts w:eastAsia="Calibri" w:cs="Calibri"/>
-              </w:rPr>
-              <w:t>, every Incident it creates</w:t>
+            <w:r>
+              <w:rPr>
+                <w:rFonts w:eastAsia="Calibri" w:cs="Calibri"/>
+              </w:rPr>
+              <w:t>AccessControlSystem, IncidentCoordinator, SecurityTeam, MedicalTeam, FacilitiesTeam, LegacyPagerAdapter, OperatorConsole, Dashboard, AuditLogger, every Incident it creates</w:t>
             </w:r>
           </w:p>
         </w:tc>
@@ -6482,14 +5336,12 @@
             </w:tcMar>
           </w:tcPr>
           <w:p>
-            <w:proofErr w:type="spellStart"/>
             <w:r>
               <w:rPr>
                 <w:rFonts w:eastAsia="Calibri" w:cs="Calibri"/>
               </w:rPr>
               <w:t>LegacyPagerAdapter</w:t>
             </w:r>
-            <w:proofErr w:type="spellEnd"/>
           </w:p>
         </w:tc>
         <w:tc>
@@ -6509,14 +5361,12 @@
             </w:tcMar>
           </w:tcPr>
           <w:p>
-            <w:proofErr w:type="spellStart"/>
             <w:r>
               <w:rPr>
                 <w:rFonts w:eastAsia="Calibri" w:cs="Calibri"/>
               </w:rPr>
               <w:t>LegacyPagerSystem</w:t>
             </w:r>
-            <w:proofErr w:type="spellEnd"/>
           </w:p>
         </w:tc>
         <w:tc>
@@ -6592,16 +5442,8 @@
               <w:rPr>
                 <w:rFonts w:eastAsia="Calibri" w:cs="Calibri"/>
               </w:rPr>
-              <w:t xml:space="preserve">its current </w:t>
-            </w:r>
-            <w:proofErr w:type="spellStart"/>
-            <w:r>
-              <w:rPr>
-                <w:rFonts w:eastAsia="Calibri" w:cs="Calibri"/>
-              </w:rPr>
-              <w:t>IncidentState</w:t>
-            </w:r>
-            <w:proofErr w:type="spellEnd"/>
+              <w:t>its current IncidentState</w:t>
+            </w:r>
           </w:p>
         </w:tc>
         <w:tc>
@@ -6625,21 +5467,7 @@
               <w:rPr>
                 <w:rFonts w:eastAsia="Calibri" w:cs="Calibri"/>
               </w:rPr>
-              <w:t xml:space="preserve">States are cheap, incident-specific, value-like objects with no reason to be shared; </w:t>
-            </w:r>
-            <w:proofErr w:type="spellStart"/>
-            <w:r>
-              <w:rPr>
-                <w:rFonts w:eastAsia="Calibri" w:cs="Calibri"/>
-              </w:rPr>
-              <w:t>unique_ptr</w:t>
-            </w:r>
-            <w:proofErr w:type="spellEnd"/>
-            <w:r>
-              <w:rPr>
-                <w:rFonts w:eastAsia="Calibri" w:cs="Calibri"/>
-              </w:rPr>
-              <w:t xml:space="preserve"> plus reset() cleanly destroys the old state when transitioning.</w:t>
+              <w:t>States are cheap, incident-specific, value-like objects with no reason to be shared; unique_ptr plus reset() cleanly destroys the old state when transitioning.</w:t>
             </w:r>
           </w:p>
         </w:tc>
@@ -6662,14 +5490,12 @@
             </w:tcMar>
           </w:tcPr>
           <w:p>
-            <w:proofErr w:type="spellStart"/>
             <w:r>
               <w:rPr>
                 <w:rFonts w:eastAsia="Calibri" w:cs="Calibri"/>
               </w:rPr>
               <w:t>OperatorConsole</w:t>
             </w:r>
-            <w:proofErr w:type="spellEnd"/>
           </w:p>
         </w:tc>
         <w:tc>
@@ -6718,49 +5544,7 @@
               <w:rPr>
                 <w:rFonts w:eastAsia="Calibri" w:cs="Calibri"/>
               </w:rPr>
-              <w:t xml:space="preserve">Commands must stay alive after </w:t>
-            </w:r>
-            <w:proofErr w:type="gramStart"/>
-            <w:r>
-              <w:rPr>
-                <w:rFonts w:eastAsia="Calibri" w:cs="Calibri"/>
-              </w:rPr>
-              <w:t>execute(</w:t>
-            </w:r>
-            <w:proofErr w:type="gramEnd"/>
-            <w:r>
-              <w:rPr>
-                <w:rFonts w:eastAsia="Calibri" w:cs="Calibri"/>
-              </w:rPr>
-              <w:t xml:space="preserve">) so </w:t>
-            </w:r>
-            <w:proofErr w:type="spellStart"/>
-            <w:r>
-              <w:rPr>
-                <w:rFonts w:eastAsia="Calibri" w:cs="Calibri"/>
-              </w:rPr>
-              <w:t>CancelCommand</w:t>
-            </w:r>
-            <w:proofErr w:type="spellEnd"/>
-            <w:r>
-              <w:rPr>
-                <w:rFonts w:eastAsia="Calibri" w:cs="Calibri"/>
-              </w:rPr>
-              <w:t xml:space="preserve"> can later call </w:t>
-            </w:r>
-            <w:proofErr w:type="gramStart"/>
-            <w:r>
-              <w:rPr>
-                <w:rFonts w:eastAsia="Calibri" w:cs="Calibri"/>
-              </w:rPr>
-              <w:t>undo(</w:t>
-            </w:r>
-            <w:proofErr w:type="gramEnd"/>
-            <w:r>
-              <w:rPr>
-                <w:rFonts w:eastAsia="Calibri" w:cs="Calibri"/>
-              </w:rPr>
-              <w:t>) on them; the console's history is the natural, bounded lifetime for that.</w:t>
+              <w:t>Commands must stay alive after execute() so CancelCommand can later call undo() on them; the console's history is the natural, bounded lifetime for that.</w:t>
             </w:r>
           </w:p>
         </w:tc>
@@ -6802,25 +5586,7 @@
           <w:sz w:val="22"/>
           <w:szCs w:val="22"/>
         </w:rPr>
-        <w:t>An operator (or the Facade, on their behalf) issues a Command (</w:t>
-      </w:r>
-      <w:proofErr w:type="spellStart"/>
-      <w:r>
-        <w:rPr>
-          <w:rFonts w:ascii="Calibri" w:eastAsia="Calibri" w:hAnsi="Calibri" w:cs="Calibri"/>
-          <w:sz w:val="22"/>
-          <w:szCs w:val="22"/>
-        </w:rPr>
-        <w:t>DispatchUnitCommand</w:t>
-      </w:r>
-      <w:proofErr w:type="spellEnd"/>
-      <w:r>
-        <w:rPr>
-          <w:rFonts w:ascii="Calibri" w:eastAsia="Calibri" w:hAnsi="Calibri" w:cs="Calibri"/>
-          <w:sz w:val="22"/>
-          <w:szCs w:val="22"/>
-        </w:rPr>
-        <w:t>).</w:t>
+        <w:t>An operator (or the Facade, on their behalf) issues a Command (DispatchUnitCommand).</w:t>
       </w:r>
     </w:p>
     <w:p>
@@ -6856,61 +5622,7 @@
           <w:sz w:val="22"/>
           <w:szCs w:val="22"/>
         </w:rPr>
-        <w:t xml:space="preserve">The command's receiver (a </w:t>
-      </w:r>
-      <w:proofErr w:type="spellStart"/>
-      <w:r>
-        <w:rPr>
-          <w:rFonts w:ascii="Calibri" w:eastAsia="Calibri" w:hAnsi="Calibri" w:cs="Calibri"/>
-          <w:sz w:val="22"/>
-          <w:szCs w:val="22"/>
-        </w:rPr>
-        <w:t>ResponseComponent</w:t>
-      </w:r>
-      <w:proofErr w:type="spellEnd"/>
-      <w:r>
-        <w:rPr>
-          <w:rFonts w:ascii="Calibri" w:eastAsia="Calibri" w:hAnsi="Calibri" w:cs="Calibri"/>
-          <w:sz w:val="22"/>
-          <w:szCs w:val="22"/>
-        </w:rPr>
-        <w:t>) reports its arrival to the Mediator (</w:t>
-      </w:r>
-      <w:proofErr w:type="spellStart"/>
-      <w:r>
-        <w:rPr>
-          <w:rFonts w:ascii="Calibri" w:eastAsia="Calibri" w:hAnsi="Calibri" w:cs="Calibri"/>
-          <w:sz w:val="22"/>
-          <w:szCs w:val="22"/>
-        </w:rPr>
-        <w:t>IncidentCoordinator</w:t>
-      </w:r>
-      <w:proofErr w:type="spellEnd"/>
-      <w:r>
-        <w:rPr>
-          <w:rFonts w:ascii="Calibri" w:eastAsia="Calibri" w:hAnsi="Calibri" w:cs="Calibri"/>
-          <w:sz w:val="22"/>
-          <w:szCs w:val="22"/>
-        </w:rPr>
-        <w:t>), which — without the component knowing any other component exists — coordinates a second colleague (</w:t>
-      </w:r>
-      <w:proofErr w:type="spellStart"/>
-      <w:r>
-        <w:rPr>
-          <w:rFonts w:ascii="Calibri" w:eastAsia="Calibri" w:hAnsi="Calibri" w:cs="Calibri"/>
-          <w:sz w:val="22"/>
-          <w:szCs w:val="22"/>
-        </w:rPr>
-        <w:t>FacilitiesTeam</w:t>
-      </w:r>
-      <w:proofErr w:type="spellEnd"/>
-      <w:r>
-        <w:rPr>
-          <w:rFonts w:ascii="Calibri" w:eastAsia="Calibri" w:hAnsi="Calibri" w:cs="Calibri"/>
-          <w:sz w:val="22"/>
-          <w:szCs w:val="22"/>
-        </w:rPr>
-        <w:t xml:space="preserve"> locking the area) and sends an alert.</w:t>
+        <w:t>The command's receiver (a ResponseComponent) reports its arrival to the Mediator (IncidentCoordinator), which — without the component knowing any other component exists — coordinates a second colleague (FacilitiesTeam locking the area) and sends an alert.</w:t>
       </w:r>
     </w:p>
     <w:p>
@@ -6928,25 +5640,7 @@
           <w:sz w:val="22"/>
           <w:szCs w:val="22"/>
         </w:rPr>
-        <w:t>That alert travels through the Adapter (</w:t>
-      </w:r>
-      <w:proofErr w:type="spellStart"/>
-      <w:r>
-        <w:rPr>
-          <w:rFonts w:ascii="Calibri" w:eastAsia="Calibri" w:hAnsi="Calibri" w:cs="Calibri"/>
-          <w:sz w:val="22"/>
-          <w:szCs w:val="22"/>
-        </w:rPr>
-        <w:t>LegacyPagerAdapter</w:t>
-      </w:r>
-      <w:proofErr w:type="spellEnd"/>
-      <w:r>
-        <w:rPr>
-          <w:rFonts w:ascii="Calibri" w:eastAsia="Calibri" w:hAnsi="Calibri" w:cs="Calibri"/>
-          <w:sz w:val="22"/>
-          <w:szCs w:val="22"/>
-        </w:rPr>
-        <w:t>) to reach the incompatible legacy paging system.</w:t>
+        <w:t>That alert travels through the Adapter (LegacyPagerAdapter) to reach the incompatible legacy paging system.</w:t>
       </w:r>
     </w:p>
     <w:p>
@@ -6964,25 +5658,7 @@
           <w:sz w:val="22"/>
           <w:szCs w:val="22"/>
         </w:rPr>
-        <w:t>All of the above, for the “report an emergency” workflow, is triggered by one Facade call (</w:t>
-      </w:r>
-      <w:proofErr w:type="spellStart"/>
-      <w:r>
-        <w:rPr>
-          <w:rFonts w:ascii="Calibri" w:eastAsia="Calibri" w:hAnsi="Calibri" w:cs="Calibri"/>
-          <w:sz w:val="22"/>
-          <w:szCs w:val="22"/>
-        </w:rPr>
-        <w:t>reportEmergency</w:t>
-      </w:r>
-      <w:proofErr w:type="spellEnd"/>
-      <w:r>
-        <w:rPr>
-          <w:rFonts w:ascii="Calibri" w:eastAsia="Calibri" w:hAnsi="Calibri" w:cs="Calibri"/>
-          <w:sz w:val="22"/>
-          <w:szCs w:val="22"/>
-        </w:rPr>
-        <w:t>), while every subsystem piece it used remains independently callable</w:t>
+        <w:t>All of the above, for the “report an emergency” workflow, is triggered by one Facade call (reportEmergency), while every subsystem piece it used remains independently callable</w:t>
       </w:r>
       <w:r>
         <w:rPr>
@@ -7096,58 +5772,7 @@
           <w:sz w:val="22"/>
           <w:szCs w:val="22"/>
         </w:rPr>
-        <w:t xml:space="preserve">A fire is reported in the Engineering Building using </w:t>
-      </w:r>
-      <w:proofErr w:type="spellStart"/>
-      <w:proofErr w:type="gramStart"/>
-      <w:r>
-        <w:rPr>
-          <w:rFonts w:ascii="Calibri" w:eastAsia="Calibri" w:hAnsi="Calibri" w:cs="Calibri"/>
-          <w:color w:val="auto"/>
-          <w:sz w:val="22"/>
-          <w:szCs w:val="22"/>
-        </w:rPr>
-        <w:t>EmergencyResponseFacade</w:t>
-      </w:r>
-      <w:proofErr w:type="spellEnd"/>
-      <w:r>
-        <w:rPr>
-          <w:rFonts w:ascii="Calibri" w:eastAsia="Calibri" w:hAnsi="Calibri" w:cs="Calibri"/>
-          <w:color w:val="auto"/>
-          <w:sz w:val="22"/>
-          <w:szCs w:val="22"/>
-        </w:rPr>
-        <w:t>::</w:t>
-      </w:r>
-      <w:proofErr w:type="spellStart"/>
-      <w:r>
-        <w:rPr>
-          <w:rFonts w:ascii="Calibri" w:eastAsia="Calibri" w:hAnsi="Calibri" w:cs="Calibri"/>
-          <w:color w:val="auto"/>
-          <w:sz w:val="22"/>
-          <w:szCs w:val="22"/>
-        </w:rPr>
-        <w:t>reportEmergency</w:t>
-      </w:r>
-      <w:proofErr w:type="spellEnd"/>
-      <w:r>
-        <w:rPr>
-          <w:rFonts w:ascii="Calibri" w:eastAsia="Calibri" w:hAnsi="Calibri" w:cs="Calibri"/>
-          <w:color w:val="auto"/>
-          <w:sz w:val="22"/>
-          <w:szCs w:val="22"/>
-        </w:rPr>
-        <w:t>(</w:t>
-      </w:r>
-      <w:proofErr w:type="gramEnd"/>
-      <w:r>
-        <w:rPr>
-          <w:rFonts w:ascii="Calibri" w:eastAsia="Calibri" w:hAnsi="Calibri" w:cs="Calibri"/>
-          <w:color w:val="auto"/>
-          <w:sz w:val="22"/>
-          <w:szCs w:val="22"/>
-        </w:rPr>
-        <w:t>). The Facade coordinates the emergency workflow, commands dispatch response teams, the Incident changes state and notifies its observers, the Mediator coordinates the response teams, and alerts are sent to the legacy paging system through the Adapter.</w:t>
+        <w:t>A fire is reported in the Engineering Building using EmergencyResponseFacade::reportEmergency(). The Facade coordinates the emergency workflow, commands dispatch response teams, the Incident changes state and notifies its observers, the Mediator coordinates the response teams, and alerts are sent to the legacy paging system through the Adapter.</w:t>
       </w:r>
     </w:p>
     <w:p>
@@ -7195,27 +5820,7 @@
           <w:sz w:val="22"/>
           <w:szCs w:val="22"/>
         </w:rPr>
-        <w:t xml:space="preserve">Façade -&gt; Command -&gt; </w:t>
-      </w:r>
-      <w:proofErr w:type="spellStart"/>
-      <w:r>
-        <w:rPr>
-          <w:rFonts w:ascii="Calibri" w:eastAsia="Calibri" w:hAnsi="Calibri" w:cs="Calibri"/>
-          <w:color w:val="auto"/>
-          <w:sz w:val="22"/>
-          <w:szCs w:val="22"/>
-        </w:rPr>
-        <w:t>Satate</w:t>
-      </w:r>
-      <w:proofErr w:type="spellEnd"/>
-      <w:r>
-        <w:rPr>
-          <w:rFonts w:ascii="Calibri" w:eastAsia="Calibri" w:hAnsi="Calibri" w:cs="Calibri"/>
-          <w:color w:val="auto"/>
-          <w:sz w:val="22"/>
-          <w:szCs w:val="22"/>
-        </w:rPr>
-        <w:t xml:space="preserve"> -&gt; Observer -&gt; Mediator -&gt; Dispatcher</w:t>
+        <w:t>Façade -&gt; Command -&gt; Satate -&gt; Observer -&gt; Mediator -&gt; Dispatcher</w:t>
       </w:r>
     </w:p>
     <w:p>
@@ -7393,79 +5998,7 @@
           <w:szCs w:val="22"/>
           <w:lang w:val="en-GB"/>
         </w:rPr>
-        <w:t xml:space="preserve">A gas leak occurs in the Chemistry Lab. The operator directly uses </w:t>
-      </w:r>
-      <w:proofErr w:type="spellStart"/>
-      <w:r>
-        <w:rPr>
-          <w:rFonts w:cs="Calibri"/>
-          <w:szCs w:val="22"/>
-          <w:lang w:val="en-GB"/>
-        </w:rPr>
-        <w:t>OperatorConsole</w:t>
-      </w:r>
-      <w:proofErr w:type="spellEnd"/>
-      <w:r>
-        <w:rPr>
-          <w:rFonts w:cs="Calibri"/>
-          <w:szCs w:val="22"/>
-          <w:lang w:val="en-GB"/>
-        </w:rPr>
-        <w:t xml:space="preserve"> instead of the Facade. A </w:t>
-      </w:r>
-      <w:proofErr w:type="spellStart"/>
-      <w:r>
-        <w:rPr>
-          <w:rFonts w:cs="Calibri"/>
-          <w:szCs w:val="22"/>
-          <w:lang w:val="en-GB"/>
-        </w:rPr>
-        <w:t>LockAreaCommand</w:t>
-      </w:r>
-      <w:proofErr w:type="spellEnd"/>
-      <w:r>
-        <w:rPr>
-          <w:rFonts w:cs="Calibri"/>
-          <w:szCs w:val="22"/>
-          <w:lang w:val="en-GB"/>
-        </w:rPr>
-        <w:t xml:space="preserve"> locks the area, an </w:t>
-      </w:r>
-      <w:proofErr w:type="spellStart"/>
-      <w:r>
-        <w:rPr>
-          <w:rFonts w:cs="Calibri"/>
-          <w:szCs w:val="22"/>
-          <w:lang w:val="en-GB"/>
-        </w:rPr>
-        <w:t>EvacuationCommand</w:t>
-      </w:r>
-      <w:proofErr w:type="spellEnd"/>
-      <w:r>
-        <w:rPr>
-          <w:rFonts w:cs="Calibri"/>
-          <w:szCs w:val="22"/>
-          <w:lang w:val="en-GB"/>
-        </w:rPr>
-        <w:t xml:space="preserve"> causes Facilities to evacuate it, and the Mediator coordinates the handoff from Facilities to Medical. A </w:t>
-      </w:r>
-      <w:proofErr w:type="spellStart"/>
-      <w:r>
-        <w:rPr>
-          <w:rFonts w:cs="Calibri"/>
-          <w:szCs w:val="22"/>
-          <w:lang w:val="en-GB"/>
-        </w:rPr>
-        <w:t>CancelCommand</w:t>
-      </w:r>
-      <w:proofErr w:type="spellEnd"/>
-      <w:r>
-        <w:rPr>
-          <w:rFonts w:cs="Calibri"/>
-          <w:szCs w:val="22"/>
-          <w:lang w:val="en-GB"/>
-        </w:rPr>
-        <w:t xml:space="preserve"> then undoes the previous lockdown.</w:t>
+        <w:t>A gas leak occurs in the Chemistry Lab. The operator directly uses OperatorConsole instead of the Facade. A LockAreaCommand locks the area, an EvacuationCommand causes Facilities to evacuate it, and the Mediator coordinates the handoff from Facilities to Medical. A CancelCommand then undoes the previous lockdown.</w:t>
       </w:r>
     </w:p>
     <w:p>
@@ -7524,7 +6057,6 @@
           <w:lang w:val="en-GB"/>
         </w:rPr>
       </w:pPr>
-      <w:proofErr w:type="spellStart"/>
       <w:r>
         <w:rPr>
           <w:rFonts w:ascii="Calibri" w:hAnsi="Calibri" w:cs="Calibri"/>
@@ -7532,37 +6064,7 @@
           <w:szCs w:val="22"/>
           <w:lang w:val="en-GB"/>
         </w:rPr>
-        <w:t>CancelCommand</w:t>
-      </w:r>
-      <w:proofErr w:type="spellEnd"/>
-      <w:r>
-        <w:rPr>
-          <w:rFonts w:ascii="Calibri" w:hAnsi="Calibri" w:cs="Calibri"/>
-          <w:sz w:val="22"/>
-          <w:szCs w:val="22"/>
-          <w:lang w:val="en-GB"/>
-        </w:rPr>
-        <w:t xml:space="preserve"> demonstrates </w:t>
-      </w:r>
-      <w:proofErr w:type="gramStart"/>
-      <w:r>
-        <w:rPr>
-          <w:rFonts w:ascii="Calibri" w:hAnsi="Calibri" w:cs="Calibri"/>
-          <w:sz w:val="22"/>
-          <w:szCs w:val="22"/>
-          <w:lang w:val="en-GB"/>
-        </w:rPr>
-        <w:t>undo(</w:t>
-      </w:r>
-      <w:proofErr w:type="gramEnd"/>
-      <w:r>
-        <w:rPr>
-          <w:rFonts w:ascii="Calibri" w:hAnsi="Calibri" w:cs="Calibri"/>
-          <w:sz w:val="22"/>
-          <w:szCs w:val="22"/>
-          <w:lang w:val="en-GB"/>
-        </w:rPr>
-        <w:t>).</w:t>
+        <w:t>CancelCommand demonstrates undo().</w:t>
       </w:r>
     </w:p>
     <w:p>
@@ -7673,6 +6175,65 @@
       <w:pPr>
         <w:pStyle w:val="Heading1"/>
         <w:spacing w:before="320" w:after="160"/>
+      </w:pPr>
+      <w:r>
+        <w:rPr>
+          <w:noProof/>
+        </w:rPr>
+        <w:drawing>
+          <wp:inline distT="0" distB="0" distL="0" distR="0" wp14:anchorId="79C1874E" wp14:editId="067CF4A8">
+            <wp:extent cx="6389370" cy="6272530"/>
+            <wp:effectExtent l="0" t="0" r="0" b="0"/>
+            <wp:docPr id="626665157" name="Picture 2"/>
+            <wp:cNvGraphicFramePr>
+              <a:graphicFrameLocks xmlns:a="http://schemas.openxmlformats.org/drawingml/2006/main" noChangeAspect="1"/>
+            </wp:cNvGraphicFramePr>
+            <a:graphic xmlns:a="http://schemas.openxmlformats.org/drawingml/2006/main">
+              <a:graphicData uri="http://schemas.openxmlformats.org/drawingml/2006/picture">
+                <pic:pic xmlns:pic="http://schemas.openxmlformats.org/drawingml/2006/picture">
+                  <pic:nvPicPr>
+                    <pic:cNvPr id="0" name="Picture 2"/>
+                    <pic:cNvPicPr>
+                      <a:picLocks noChangeAspect="1" noChangeArrowheads="1"/>
+                    </pic:cNvPicPr>
+                  </pic:nvPicPr>
+                  <pic:blipFill>
+                    <a:blip r:embed="rId6" cstate="print">
+                      <a:extLst>
+                        <a:ext uri="{28A0092B-C50C-407E-A947-70E740481C1C}">
+                          <a14:useLocalDpi xmlns:a14="http://schemas.microsoft.com/office/drawing/2010/main" val="0"/>
+                        </a:ext>
+                      </a:extLst>
+                    </a:blip>
+                    <a:srcRect/>
+                    <a:stretch>
+                      <a:fillRect/>
+                    </a:stretch>
+                  </pic:blipFill>
+                  <pic:spPr bwMode="auto">
+                    <a:xfrm>
+                      <a:off x="0" y="0"/>
+                      <a:ext cx="6389370" cy="6272530"/>
+                    </a:xfrm>
+                    <a:prstGeom prst="rect">
+                      <a:avLst/>
+                    </a:prstGeom>
+                    <a:noFill/>
+                    <a:ln>
+                      <a:noFill/>
+                    </a:ln>
+                  </pic:spPr>
+                </pic:pic>
+              </a:graphicData>
+            </a:graphic>
+          </wp:inline>
+        </w:drawing>
+      </w:r>
+    </w:p>
+    <w:p>
+      <w:pPr>
+        <w:pStyle w:val="Heading1"/>
+        <w:spacing w:before="320" w:after="160"/>
         <w:rPr>
           <w:lang w:val="en-GB"/>
         </w:rPr>
@@ -7821,98 +6382,58 @@
           <w:szCs w:val="32"/>
           <w:lang w:val="en-GB"/>
         </w:rPr>
-        <w:t xml:space="preserve">5.2 </w:t>
-      </w:r>
-      <w:proofErr w:type="spellStart"/>
-      <w:r>
+        <w:t>5.2 Dockerfile</w:t>
+      </w:r>
+    </w:p>
+    <w:p>
+      <w:pPr>
+        <w:rPr>
+          <w:lang w:val="en-GB"/>
+        </w:rPr>
+      </w:pPr>
+      <w:r>
+        <w:t>The Dockerfile creates an Ubuntu-based environment and installs the tools required to build, debug and analyse CampusGuard, including g++, make, GDB and Valgrind. The project files are copied into the container and compiled using the Makefile. When the container starts, the campusguard executable automatically runs the two demonstration scenarios.</w:t>
+      </w:r>
+    </w:p>
+    <w:p>
+      <w:pPr>
+        <w:spacing w:after="140"/>
         <w:rPr>
           <w:color w:val="0070C0"/>
           <w:sz w:val="32"/>
           <w:szCs w:val="32"/>
           <w:lang w:val="en-GB"/>
         </w:rPr>
-        <w:t>Dockerfile</w:t>
-      </w:r>
-      <w:proofErr w:type="spellEnd"/>
-    </w:p>
-    <w:p>
-      <w:pPr>
-        <w:rPr>
-          <w:lang w:val="en-GB"/>
-        </w:rPr>
-      </w:pPr>
-      <w:r>
-        <w:t xml:space="preserve">The </w:t>
-      </w:r>
-      <w:proofErr w:type="spellStart"/>
-      <w:r>
-        <w:t>Dockerfile</w:t>
-      </w:r>
-      <w:proofErr w:type="spellEnd"/>
-      <w:r>
-        <w:t xml:space="preserve"> creates an Ubuntu-based environment and installs the tools required to build, debug and analyse </w:t>
-      </w:r>
-      <w:proofErr w:type="spellStart"/>
-      <w:r>
-        <w:t>CampusGuard</w:t>
-      </w:r>
-      <w:proofErr w:type="spellEnd"/>
-      <w:r>
-        <w:t xml:space="preserve">, including g++, make, </w:t>
-      </w:r>
-      <w:proofErr w:type="spellStart"/>
-      <w:r>
-        <w:t>GDB</w:t>
-      </w:r>
-      <w:proofErr w:type="spellEnd"/>
-      <w:r>
-        <w:t xml:space="preserve"> and </w:t>
-      </w:r>
-      <w:proofErr w:type="spellStart"/>
-      <w:r>
-        <w:t>Valgrind</w:t>
-      </w:r>
-      <w:proofErr w:type="spellEnd"/>
-      <w:r>
-        <w:t xml:space="preserve">. The project files are copied into the container and compiled using the </w:t>
-      </w:r>
-      <w:proofErr w:type="spellStart"/>
-      <w:r>
-        <w:t>Makefile</w:t>
-      </w:r>
-      <w:proofErr w:type="spellEnd"/>
-      <w:r>
-        <w:t xml:space="preserve">. When the container starts, the </w:t>
-      </w:r>
-      <w:proofErr w:type="spellStart"/>
-      <w:r>
-        <w:t>campusguard</w:t>
-      </w:r>
-      <w:proofErr w:type="spellEnd"/>
-      <w:r>
-        <w:t xml:space="preserve"> executable automatically runs the two demonstration scenarios.</w:t>
-      </w:r>
-    </w:p>
-    <w:p>
-      <w:pPr>
-        <w:spacing w:after="140"/>
+      </w:pPr>
+      <w:r>
         <w:rPr>
           <w:color w:val="0070C0"/>
           <w:sz w:val="32"/>
           <w:szCs w:val="32"/>
           <w:lang w:val="en-GB"/>
         </w:rPr>
-      </w:pPr>
-      <w:r>
+        <w:t>5.3 docker-compose.yml</w:t>
+      </w:r>
+    </w:p>
+    <w:p>
+      <w:pPr>
+        <w:rPr>
+          <w:lang w:val="en-GB"/>
+        </w:rPr>
+      </w:pPr>
+      <w:r>
+        <w:t>Docker Compose builds the CampusGuard image using the Dockerfile in the project directory and creates the campusguard container.</w:t>
+      </w:r>
+    </w:p>
+    <w:p>
+      <w:pPr>
+        <w:spacing w:after="140"/>
         <w:rPr>
           <w:color w:val="0070C0"/>
           <w:sz w:val="32"/>
           <w:szCs w:val="32"/>
-          <w:lang w:val="en-GB"/>
-        </w:rPr>
-        <w:t>5.3 docker-</w:t>
-      </w:r>
-      <w:proofErr w:type="spellStart"/>
+        </w:rPr>
+      </w:pPr>
       <w:r>
         <w:rPr>
           <w:color w:val="0070C0"/>
@@ -7920,69 +6441,114 @@
           <w:szCs w:val="32"/>
           <w:lang w:val="en-GB"/>
         </w:rPr>
-        <w:t>compose.yml</w:t>
-      </w:r>
-      <w:proofErr w:type="spellEnd"/>
-    </w:p>
-    <w:p>
-      <w:pPr>
-        <w:rPr>
-          <w:lang w:val="en-GB"/>
-        </w:rPr>
-      </w:pPr>
-      <w:r>
-        <w:t xml:space="preserve">Docker Compose builds the </w:t>
-      </w:r>
-      <w:proofErr w:type="spellStart"/>
-      <w:r>
-        <w:t>CampusGuard</w:t>
-      </w:r>
-      <w:proofErr w:type="spellEnd"/>
-      <w:r>
-        <w:t xml:space="preserve"> image using the </w:t>
-      </w:r>
-      <w:proofErr w:type="spellStart"/>
-      <w:r>
-        <w:t>Dockerfile</w:t>
-      </w:r>
-      <w:proofErr w:type="spellEnd"/>
-      <w:r>
-        <w:t xml:space="preserve"> in the project directory and creates the </w:t>
-      </w:r>
-      <w:proofErr w:type="spellStart"/>
-      <w:r>
-        <w:t>campusguard</w:t>
-      </w:r>
-      <w:proofErr w:type="spellEnd"/>
-      <w:r>
-        <w:t xml:space="preserve"> container.</w:t>
-      </w:r>
-    </w:p>
-    <w:p>
-      <w:pPr>
-        <w:spacing w:after="140"/>
+        <w:t xml:space="preserve">5.4 </w:t>
+      </w:r>
+      <w:r>
         <w:rPr>
           <w:color w:val="0070C0"/>
           <w:sz w:val="32"/>
           <w:szCs w:val="32"/>
         </w:rPr>
-      </w:pPr>
-      <w:r>
+        <w:t>Docker Run Instructions</w:t>
+      </w:r>
+    </w:p>
+    <w:p>
+      <w:pPr>
+        <w:rPr>
+          <w:rFonts w:ascii="Courier New" w:hAnsi="Courier New" w:cs="Courier New"/>
+          <w:b/>
+          <w:bCs/>
+          <w:lang w:val="en-GB"/>
+        </w:rPr>
+      </w:pPr>
+      <w:r>
+        <w:rPr>
+          <w:rFonts w:ascii="Courier New" w:hAnsi="Courier New" w:cs="Courier New"/>
+          <w:b/>
+          <w:bCs/>
+          <w:lang w:val="en-GB"/>
+        </w:rPr>
+        <w:t xml:space="preserve">docker compose up </w:t>
+      </w:r>
+      <w:r>
+        <w:rPr>
+          <w:rFonts w:ascii="Courier New" w:hAnsi="Courier New" w:cs="Courier New"/>
+          <w:b/>
+          <w:bCs/>
+          <w:lang w:val="en-GB"/>
+        </w:rPr>
+        <w:t>–</w:t>
+      </w:r>
+      <w:r>
+        <w:rPr>
+          <w:rFonts w:ascii="Courier New" w:hAnsi="Courier New" w:cs="Courier New"/>
+          <w:b/>
+          <w:bCs/>
+          <w:lang w:val="en-GB"/>
+        </w:rPr>
+        <w:t>build</w:t>
+      </w:r>
+    </w:p>
+    <w:p>
+      <w:pPr>
+        <w:rPr>
+          <w:lang w:val="en-GB"/>
+        </w:rPr>
+      </w:pPr>
+      <w:r>
+        <w:rPr>
+          <w:lang w:val="en-GB"/>
+        </w:rPr>
+        <w:t>This builds the Docker image, compiles the complete CampusGuard application and starts the container. The application then automatically executes both end-to-end scenarios.</w:t>
+      </w:r>
+    </w:p>
+    <w:p>
+      <w:pPr>
+        <w:rPr>
+          <w:lang w:val="en-GB"/>
+        </w:rPr>
+      </w:pPr>
+    </w:p>
+    <w:p>
+      <w:pPr>
+        <w:rPr>
+          <w:lang w:val="en-GB"/>
+        </w:rPr>
+      </w:pPr>
+      <w:r>
+        <w:rPr>
+          <w:lang w:val="en-GB"/>
+        </w:rPr>
+        <w:t xml:space="preserve">Remove container: </w:t>
+      </w:r>
+      <w:r>
+        <w:rPr>
+          <w:rFonts w:ascii="Courier New" w:hAnsi="Courier New" w:cs="Courier New"/>
+          <w:b/>
+          <w:bCs/>
+          <w:lang w:val="en-GB"/>
+        </w:rPr>
+        <w:t>docker compose down</w:t>
+      </w:r>
+    </w:p>
+    <w:p>
+      <w:pPr>
+        <w:spacing w:after="140"/>
         <w:rPr>
           <w:color w:val="0070C0"/>
           <w:sz w:val="32"/>
           <w:szCs w:val="32"/>
           <w:lang w:val="en-GB"/>
         </w:rPr>
-        <w:t xml:space="preserve">5.4 </w:t>
-      </w:r>
+      </w:pPr>
       <w:r>
         <w:rPr>
           <w:color w:val="0070C0"/>
           <w:sz w:val="32"/>
           <w:szCs w:val="32"/>
-        </w:rPr>
-        <w:t>Docker Run Instructions</w:t>
+          <w:lang w:val="en-GB"/>
+        </w:rPr>
+        <w:t>5.5 Valgrind Evidence</w:t>
       </w:r>
     </w:p>
     <w:p>
@@ -8001,17 +6567,18 @@
           <w:bCs/>
           <w:lang w:val="en-GB"/>
         </w:rPr>
-        <w:t xml:space="preserve">docker compose up </w:t>
-      </w:r>
-      <w:r>
+        <w:t>docker compose run --rm campusguard bash</w:t>
+      </w:r>
+    </w:p>
+    <w:p>
+      <w:pPr>
         <w:rPr>
           <w:rFonts w:ascii="Courier New" w:hAnsi="Courier New" w:cs="Courier New"/>
           <w:b/>
           <w:bCs/>
           <w:lang w:val="en-GB"/>
         </w:rPr>
-        <w:t>–</w:t>
-      </w:r>
+      </w:pPr>
       <w:r>
         <w:rPr>
           <w:rFonts w:ascii="Courier New" w:hAnsi="Courier New" w:cs="Courier New"/>
@@ -8019,63 +6586,7 @@
           <w:bCs/>
           <w:lang w:val="en-GB"/>
         </w:rPr>
-        <w:t>build</w:t>
-      </w:r>
-    </w:p>
-    <w:p>
-      <w:pPr>
-        <w:rPr>
-          <w:lang w:val="en-GB"/>
-        </w:rPr>
-      </w:pPr>
-      <w:r>
-        <w:rPr>
-          <w:lang w:val="en-GB"/>
-        </w:rPr>
-        <w:t xml:space="preserve">This builds the Docker image, compiles the complete </w:t>
-      </w:r>
-      <w:proofErr w:type="spellStart"/>
-      <w:r>
-        <w:rPr>
-          <w:lang w:val="en-GB"/>
-        </w:rPr>
-        <w:t>CampusGuard</w:t>
-      </w:r>
-      <w:proofErr w:type="spellEnd"/>
-      <w:r>
-        <w:rPr>
-          <w:lang w:val="en-GB"/>
-        </w:rPr>
-        <w:t xml:space="preserve"> application and starts the container. The application then automatically executes both end-to-end scenarios.</w:t>
-      </w:r>
-    </w:p>
-    <w:p>
-      <w:pPr>
-        <w:rPr>
-          <w:lang w:val="en-GB"/>
-        </w:rPr>
-      </w:pPr>
-    </w:p>
-    <w:p>
-      <w:pPr>
-        <w:rPr>
-          <w:lang w:val="en-GB"/>
-        </w:rPr>
-      </w:pPr>
-      <w:r>
-        <w:rPr>
-          <w:lang w:val="en-GB"/>
-        </w:rPr>
-        <w:t xml:space="preserve">Remove container: </w:t>
-      </w:r>
-      <w:r>
-        <w:rPr>
-          <w:rFonts w:ascii="Courier New" w:hAnsi="Courier New" w:cs="Courier New"/>
-          <w:b/>
-          <w:bCs/>
-          <w:lang w:val="en-GB"/>
-        </w:rPr>
-        <w:t>docker compose down</w:t>
+        <w:t>valgrind --leak-check=full --show-leak-kinds=all ./campusguard</w:t>
       </w:r>
     </w:p>
     <w:p>
@@ -8095,19 +6606,96 @@
           <w:szCs w:val="32"/>
           <w:lang w:val="en-GB"/>
         </w:rPr>
-        <w:t xml:space="preserve">5.5 </w:t>
-      </w:r>
-      <w:proofErr w:type="spellStart"/>
-      <w:r>
+        <w:drawing>
+          <wp:inline distT="0" distB="0" distL="0" distR="0" wp14:anchorId="3C1BB8F9" wp14:editId="0E93FDF4">
+            <wp:extent cx="5991269" cy="2400318"/>
+            <wp:effectExtent l="0" t="0" r="0" b="0"/>
+            <wp:docPr id="1333780025" name="Picture 1"/>
+            <wp:cNvGraphicFramePr>
+              <a:graphicFrameLocks xmlns:a="http://schemas.openxmlformats.org/drawingml/2006/main" noChangeAspect="1"/>
+            </wp:cNvGraphicFramePr>
+            <a:graphic xmlns:a="http://schemas.openxmlformats.org/drawingml/2006/main">
+              <a:graphicData uri="http://schemas.openxmlformats.org/drawingml/2006/picture">
+                <pic:pic xmlns:pic="http://schemas.openxmlformats.org/drawingml/2006/picture">
+                  <pic:nvPicPr>
+                    <pic:cNvPr id="1333780025" name=""/>
+                    <pic:cNvPicPr/>
+                  </pic:nvPicPr>
+                  <pic:blipFill>
+                    <a:blip r:embed="rId7"/>
+                    <a:stretch>
+                      <a:fillRect/>
+                    </a:stretch>
+                  </pic:blipFill>
+                  <pic:spPr>
+                    <a:xfrm>
+                      <a:off x="0" y="0"/>
+                      <a:ext cx="5991269" cy="2400318"/>
+                    </a:xfrm>
+                    <a:prstGeom prst="rect">
+                      <a:avLst/>
+                    </a:prstGeom>
+                  </pic:spPr>
+                </pic:pic>
+              </a:graphicData>
+            </a:graphic>
+          </wp:inline>
+        </w:drawing>
+      </w:r>
+    </w:p>
+    <w:p>
+      <w:pPr>
+        <w:rPr>
+          <w:lang w:val="en-GB"/>
+        </w:rPr>
+      </w:pPr>
+      <w:r>
+        <w:t xml:space="preserve">Valgrind was run on the final CampusGuard executable to check for memory leaks and memory-related errors. The program completed with </w:t>
+      </w:r>
+      <w:r>
+        <w:rPr>
+          <w:b/>
+          <w:bCs/>
+        </w:rPr>
+        <w:t>76 allocations and 76 frees</w:t>
+      </w:r>
+      <w:r>
+        <w:t xml:space="preserve">, with </w:t>
+      </w:r>
+      <w:r>
+        <w:rPr>
+          <w:b/>
+          <w:bCs/>
+        </w:rPr>
+        <w:t>0 bytes remaining in use at exit</w:t>
+      </w:r>
+      <w:r>
+        <w:t xml:space="preserve">. Valgrind reported that all heap blocks were freed and that no memory leaks were possible. The final error summary also reported </w:t>
+      </w:r>
+      <w:r>
+        <w:rPr>
+          <w:b/>
+          <w:bCs/>
+        </w:rPr>
+        <w:t>0 errors</w:t>
+      </w:r>
+      <w:r>
+        <w:t>.</w:t>
+      </w:r>
+    </w:p>
+    <w:p>
+      <w:pPr>
+        <w:tabs>
+          <w:tab w:val="left" w:pos="3394"/>
+        </w:tabs>
+        <w:spacing w:after="140"/>
         <w:rPr>
           <w:color w:val="0070C0"/>
           <w:sz w:val="32"/>
           <w:szCs w:val="32"/>
           <w:lang w:val="en-GB"/>
         </w:rPr>
-        <w:t>Valgrind</w:t>
-      </w:r>
-      <w:proofErr w:type="spellEnd"/>
+      </w:pPr>
       <w:r>
         <w:rPr>
           <w:color w:val="0070C0"/>
@@ -8115,39 +6703,105 @@
           <w:szCs w:val="32"/>
           <w:lang w:val="en-GB"/>
         </w:rPr>
-        <w:t xml:space="preserve"> Evidence</w:t>
-      </w:r>
-    </w:p>
-    <w:p>
-      <w:pPr>
-        <w:spacing w:after="140"/>
+        <w:t>5.6 GDB Investigation</w:t>
+      </w:r>
+      <w:r>
         <w:rPr>
           <w:color w:val="0070C0"/>
           <w:sz w:val="32"/>
           <w:szCs w:val="32"/>
           <w:lang w:val="en-GB"/>
         </w:rPr>
-      </w:pPr>
-      <w:r>
+        <w:tab/>
+      </w:r>
+    </w:p>
+    <w:p>
+      <w:pPr>
+        <w:rPr>
+          <w:lang w:val="en-GB"/>
+        </w:rPr>
+      </w:pPr>
+      <w:r>
+        <w:rPr>
+          <w:b/>
+          <w:bCs/>
+          <w:lang w:val="en-GB"/>
+        </w:rPr>
+        <w:t>Bug:</w:t>
+      </w:r>
+      <w:r>
+        <w:rPr>
+          <w:lang w:val="en-GB"/>
+        </w:rPr>
+        <w:t xml:space="preserve"> Dispatching the second response team caused an invalid state transition because the incident was already Dispatched.</w:t>
+      </w:r>
+    </w:p>
+    <w:p>
+      <w:pPr>
+        <w:rPr>
+          <w:lang w:val="en-GB"/>
+        </w:rPr>
+      </w:pPr>
+      <w:r>
+        <w:rPr>
+          <w:b/>
+          <w:bCs/>
+          <w:lang w:val="en-GB"/>
+        </w:rPr>
+        <w:t>Investigation:</w:t>
+      </w:r>
+      <w:r>
+        <w:rPr>
+          <w:lang w:val="en-GB"/>
+        </w:rPr>
+        <w:t xml:space="preserve"> A breakpoint was placed in DispatchUnitCommand::execute(). GDB showed the incident was "Reported" on the first dispatch and "Dispatched" on the second.</w:t>
+      </w:r>
+    </w:p>
+    <w:p>
+      <w:pPr>
+        <w:rPr>
+          <w:lang w:val="en-GB"/>
+        </w:rPr>
+      </w:pPr>
+      <w:r>
+        <w:rPr>
+          <w:b/>
+          <w:bCs/>
+          <w:lang w:val="en-GB"/>
+        </w:rPr>
+        <w:t>Fix:</w:t>
+      </w:r>
+      <w:r>
+        <w:rPr>
+          <w:lang w:val="en-GB"/>
+        </w:rPr>
+        <w:t xml:space="preserve"> incident-&gt;dispatch() is now only called when the incident is still Reported.</w:t>
+      </w:r>
+    </w:p>
+    <w:p>
+      <w:pPr>
+        <w:tabs>
+          <w:tab w:val="left" w:pos="3394"/>
+        </w:tabs>
+        <w:spacing w:after="140"/>
         <w:rPr>
           <w:color w:val="0070C0"/>
           <w:sz w:val="32"/>
           <w:szCs w:val="32"/>
           <w:lang w:val="en-GB"/>
         </w:rPr>
-        <w:t xml:space="preserve">5.6 </w:t>
-      </w:r>
-      <w:proofErr w:type="spellStart"/>
-      <w:r>
+      </w:pPr>
+    </w:p>
+    <w:p>
+      <w:pPr>
+        <w:spacing w:after="140"/>
         <w:rPr>
           <w:color w:val="0070C0"/>
           <w:sz w:val="32"/>
           <w:szCs w:val="32"/>
           <w:lang w:val="en-GB"/>
         </w:rPr>
-        <w:t>GDB</w:t>
-      </w:r>
-      <w:proofErr w:type="spellEnd"/>
+      </w:pPr>
       <w:r>
         <w:rPr>
           <w:color w:val="0070C0"/>
@@ -8155,7 +6809,41 @@
           <w:szCs w:val="32"/>
           <w:lang w:val="en-GB"/>
         </w:rPr>
-        <w:t xml:space="preserve"> Investigation</w:t>
+        <w:drawing>
+          <wp:inline distT="0" distB="0" distL="0" distR="0" wp14:anchorId="11B9913C" wp14:editId="170554FC">
+            <wp:extent cx="4943511" cy="1285884"/>
+            <wp:effectExtent l="0" t="0" r="9525" b="9525"/>
+            <wp:docPr id="117931929" name="Picture 1"/>
+            <wp:cNvGraphicFramePr>
+              <a:graphicFrameLocks xmlns:a="http://schemas.openxmlformats.org/drawingml/2006/main" noChangeAspect="1"/>
+            </wp:cNvGraphicFramePr>
+            <a:graphic xmlns:a="http://schemas.openxmlformats.org/drawingml/2006/main">
+              <a:graphicData uri="http://schemas.openxmlformats.org/drawingml/2006/picture">
+                <pic:pic xmlns:pic="http://schemas.openxmlformats.org/drawingml/2006/picture">
+                  <pic:nvPicPr>
+                    <pic:cNvPr id="117931929" name=""/>
+                    <pic:cNvPicPr/>
+                  </pic:nvPicPr>
+                  <pic:blipFill>
+                    <a:blip r:embed="rId8"/>
+                    <a:stretch>
+                      <a:fillRect/>
+                    </a:stretch>
+                  </pic:blipFill>
+                  <pic:spPr>
+                    <a:xfrm>
+                      <a:off x="0" y="0"/>
+                      <a:ext cx="4943511" cy="1285884"/>
+                    </a:xfrm>
+                    <a:prstGeom prst="rect">
+                      <a:avLst/>
+                    </a:prstGeom>
+                  </pic:spPr>
+                </pic:pic>
+              </a:graphicData>
+            </a:graphic>
+          </wp:inline>
+        </w:drawing>
       </w:r>
     </w:p>
     <w:p>
@@ -8168,6 +6856,49 @@
           <w:lang w:val="en-GB"/>
         </w:rPr>
       </w:pPr>
+      <w:r>
+        <w:rPr>
+          <w:color w:val="0070C0"/>
+          <w:sz w:val="32"/>
+          <w:szCs w:val="32"/>
+          <w:lang w:val="en-GB"/>
+        </w:rPr>
+        <w:drawing>
+          <wp:inline distT="0" distB="0" distL="0" distR="0" wp14:anchorId="54B0CF0C" wp14:editId="4CC098B7">
+            <wp:extent cx="6179480" cy="3063379"/>
+            <wp:effectExtent l="0" t="0" r="0" b="3810"/>
+            <wp:docPr id="1150629815" name="Picture 1"/>
+            <wp:cNvGraphicFramePr>
+              <a:graphicFrameLocks xmlns:a="http://schemas.openxmlformats.org/drawingml/2006/main" noChangeAspect="1"/>
+            </wp:cNvGraphicFramePr>
+            <a:graphic xmlns:a="http://schemas.openxmlformats.org/drawingml/2006/main">
+              <a:graphicData uri="http://schemas.openxmlformats.org/drawingml/2006/picture">
+                <pic:pic xmlns:pic="http://schemas.openxmlformats.org/drawingml/2006/picture">
+                  <pic:nvPicPr>
+                    <pic:cNvPr id="1150629815" name=""/>
+                    <pic:cNvPicPr/>
+                  </pic:nvPicPr>
+                  <pic:blipFill>
+                    <a:blip r:embed="rId9"/>
+                    <a:stretch>
+                      <a:fillRect/>
+                    </a:stretch>
+                  </pic:blipFill>
+                  <pic:spPr>
+                    <a:xfrm>
+                      <a:off x="0" y="0"/>
+                      <a:ext cx="6181522" cy="3064391"/>
+                    </a:xfrm>
+                    <a:prstGeom prst="rect">
+                      <a:avLst/>
+                    </a:prstGeom>
+                  </pic:spPr>
+                </pic:pic>
+              </a:graphicData>
+            </a:graphic>
+          </wp:inline>
+        </w:drawing>
+      </w:r>
     </w:p>
     <w:p>
       <w:pPr>
@@ -8191,6 +6922,16 @@
           <w:lang w:val="en-GB"/>
         </w:rPr>
         <w:t>Collaboration reflection</w:t>
+      </w:r>
+    </w:p>
+    <w:p>
+      <w:pPr>
+        <w:rPr>
+          <w:lang w:val="en-GB"/>
+        </w:rPr>
+      </w:pPr>
+      <w:r>
+        <w:t>The work was divided among the team based on the main areas of the project. One member focused on the system design and implementation of the six design patterns, including the class structure and pattern integration. Another member focused on the UML and behavioural diagrams, ensuring they matched the final implementation. The remaining work focused on the end-to-end scenarios and engineering quality, including main.cpp, the Makefile, Dockerfile, Docker Compose, Valgrind testing and the GDB investigation. The team then combined and reviewed the work for the final submission.</w:t>
       </w:r>
     </w:p>
     <w:p>
@@ -8203,7 +6944,6 @@
           <w:color w:val="2F5496"/>
           <w:sz w:val="28"/>
           <w:szCs w:val="28"/>
-          <w:lang w:val="en-GB"/>
         </w:rPr>
       </w:pPr>
       <w:r>
@@ -8228,10 +6968,7 @@
         </w:rPr>
         <w:t>ontribution statement</w:t>
       </w:r>
-    </w:p>
-    <w:p>
-      <w:pPr>
-        <w:spacing w:after="140"/>
+      <w:r>
         <w:rPr>
           <w:rFonts w:eastAsia="Calibri" w:cs="Calibri"/>
           <w:b/>
@@ -8239,7 +6976,110 @@
           <w:color w:val="2F5496"/>
           <w:sz w:val="28"/>
           <w:szCs w:val="28"/>
-          <w:lang w:val="en-GB"/>
+        </w:rPr>
+        <w:t>s</w:t>
+      </w:r>
+    </w:p>
+    <w:p>
+      <w:pPr>
+        <w:rPr>
+          <w:rFonts w:eastAsia="Calibri"/>
+          <w:lang w:val="en-GB"/>
+        </w:rPr>
+      </w:pPr>
+      <w:r>
+        <w:rPr>
+          <w:rFonts w:eastAsia="Calibri"/>
+          <w:lang w:val="en-GB"/>
+        </w:rPr>
+        <w:t>Showlon</w:t>
+      </w:r>
+      <w:r>
+        <w:rPr>
+          <w:rFonts w:eastAsia="Calibri"/>
+          <w:lang w:val="en-GB"/>
+        </w:rPr>
+        <w:t>:</w:t>
+      </w:r>
+      <w:r>
+        <w:rPr>
+          <w:rFonts w:eastAsia="Calibri"/>
+          <w:lang w:val="en-GB"/>
+        </w:rPr>
+        <w:br/>
+        <w:t>Contributed to the system design and implementation of the six design patterns, including the class structure and integration between the patterns.</w:t>
+      </w:r>
+    </w:p>
+    <w:p>
+      <w:pPr>
+        <w:rPr>
+          <w:rFonts w:eastAsia="Calibri"/>
+          <w:lang w:val="en-GB"/>
+        </w:rPr>
+      </w:pPr>
+      <w:r>
+        <w:rPr>
+          <w:rFonts w:eastAsia="Calibri"/>
+          <w:lang w:val="en-GB"/>
+        </w:rPr>
+        <w:t>Francois</w:t>
+      </w:r>
+      <w:r>
+        <w:rPr>
+          <w:rFonts w:eastAsia="Calibri"/>
+          <w:lang w:val="en-GB"/>
+        </w:rPr>
+        <w:t>:</w:t>
+      </w:r>
+      <w:r>
+        <w:rPr>
+          <w:rFonts w:eastAsia="Calibri"/>
+          <w:lang w:val="en-GB"/>
+        </w:rPr>
+        <w:br/>
+        <w:t>Contributed to the UML class diagram and behavioural diagrams, ensuring that the diagrams reflected the final system implementation.</w:t>
+      </w:r>
+    </w:p>
+    <w:p>
+      <w:pPr>
+        <w:rPr>
+          <w:rFonts w:eastAsia="Calibri"/>
+          <w:lang w:val="en-GB"/>
+        </w:rPr>
+      </w:pPr>
+      <w:r>
+        <w:rPr>
+          <w:rFonts w:eastAsia="Calibri"/>
+          <w:lang w:val="en-GB"/>
+        </w:rPr>
+        <w:t>Tamima</w:t>
+      </w:r>
+      <w:r>
+        <w:rPr>
+          <w:rFonts w:eastAsia="Calibri"/>
+          <w:lang w:val="en-GB"/>
+        </w:rPr>
+        <w:t>:</w:t>
+      </w:r>
+      <w:r>
+        <w:rPr>
+          <w:rFonts w:eastAsia="Calibri"/>
+          <w:lang w:val="en-GB"/>
+        </w:rPr>
+        <w:br/>
+        <w:t>Contributed to the end-to-end scenarios and engineering quality, including main.cpp, Makefile, Dockerfile, Docker Compose, Valgrind testing and the GDB investigation.</w:t>
+      </w:r>
+    </w:p>
+    <w:p>
+      <w:pPr>
+        <w:spacing w:after="140"/>
+        <w:rPr>
+          <w:rFonts w:eastAsia="Calibri" w:cs="Calibri"/>
+          <w:b/>
+          <w:bCs/>
+          <w:color w:val="2F5496"/>
+          <w:sz w:val="28"/>
+          <w:szCs w:val="28"/>
         </w:rPr>
       </w:pPr>
     </w:p>

</xml_diff>